<commit_message>
Changes after revision, figure s4 is added to the supplementary
</commit_message>
<xml_diff>
--- a/Supplementary Figures.docx
+++ b/Supplementary Figures.docx
@@ -4,22 +4,287 @@
   <w:body>
     <w:p>
       <w:pPr>
+        <w:jc w:val="center"/>
+        <w:rPr>
+          <w:sz w:val="36"/>
+          <w:szCs w:val="36"/>
+        </w:rPr>
+      </w:pPr>
+      <w:bookmarkStart w:id="0" w:name="_Hlk218261450"/>
+      <w:r>
+        <w:rPr>
+          <w:sz w:val="36"/>
+          <w:szCs w:val="36"/>
+        </w:rPr>
+        <w:t>Supplementary Materials for</w:t>
+      </w:r>
+    </w:p>
+    <w:p/>
+    <w:p>
+      <w:pPr>
+        <w:jc w:val="center"/>
+        <w:rPr>
+          <w:b/>
+          <w:bCs/>
+          <w:sz w:val="28"/>
+          <w:szCs w:val="28"/>
+        </w:rPr>
+      </w:pPr>
+      <w:r>
+        <w:rPr>
+          <w:b/>
+          <w:bCs/>
+          <w:sz w:val="28"/>
+          <w:szCs w:val="28"/>
+        </w:rPr>
+        <w:t>Decoding Functional Specialization in GPCRs through Evolution-Guided</w:t>
+      </w:r>
+      <w:r>
+        <w:rPr>
+          <w:b/>
+          <w:bCs/>
+          <w:sz w:val="28"/>
+          <w:szCs w:val="28"/>
+        </w:rPr>
+        <w:t xml:space="preserve"> </w:t>
+      </w:r>
+      <w:r>
+        <w:rPr>
+          <w:b/>
+          <w:bCs/>
+          <w:sz w:val="28"/>
+          <w:szCs w:val="28"/>
+        </w:rPr>
+        <w:t>Residue Profiling</w:t>
+      </w:r>
+    </w:p>
+    <w:p/>
+    <w:p>
+      <w:pPr>
+        <w:rPr>
+          <w:vertAlign w:val="superscript"/>
+        </w:rPr>
+      </w:pPr>
+      <w:r>
+        <w:t>Berkay Selçuk</w:t>
+      </w:r>
+      <w:r>
+        <w:rPr>
+          <w:vertAlign w:val="superscript"/>
+        </w:rPr>
+        <w:t>1,2</w:t>
+      </w:r>
+      <w:r>
+        <w:t xml:space="preserve">, </w:t>
+      </w:r>
+      <w:r>
+        <w:t>Gunnar Schulte</w:t>
+      </w:r>
+      <w:r>
+        <w:rPr>
+          <w:vertAlign w:val="superscript"/>
+        </w:rPr>
+        <w:t>3</w:t>
+      </w:r>
+      <w:r>
+        <w:t xml:space="preserve">, </w:t>
+      </w:r>
+      <w:r>
+        <w:t>Igor B. Zhulin</w:t>
+      </w:r>
+      <w:r>
+        <w:rPr>
+          <w:vertAlign w:val="superscript"/>
+        </w:rPr>
+        <w:t>2</w:t>
+      </w:r>
+      <w:r>
+        <w:t>, Ogün Adebali</w:t>
+      </w:r>
+      <w:r>
+        <w:rPr>
+          <w:vertAlign w:val="superscript"/>
+        </w:rPr>
+        <w:t>1</w:t>
+      </w:r>
+    </w:p>
+    <w:p>
+      <w:r>
+        <w:rPr>
+          <w:vertAlign w:val="superscript"/>
+        </w:rPr>
+        <w:t>1</w:t>
+      </w:r>
+      <w:r>
+        <w:t xml:space="preserve"> Molecular Biology, Genetics and Bioengineering Program, Faculty of Engineering and Natural Sciences, </w:t>
+      </w:r>
+      <w:proofErr w:type="spellStart"/>
+      <w:r>
+        <w:t>Sabanci</w:t>
+      </w:r>
+      <w:proofErr w:type="spellEnd"/>
+      <w:r>
+        <w:t xml:space="preserve"> University, Istanbul, Türkiye </w:t>
+      </w:r>
+    </w:p>
+    <w:p>
+      <w:r>
+        <w:rPr>
+          <w:vertAlign w:val="superscript"/>
+        </w:rPr>
+        <w:t>2</w:t>
+      </w:r>
+      <w:r>
+        <w:t xml:space="preserve"> Department of Microbiology and Translational Data Analytics Institute, The Ohio State University, US</w:t>
+      </w:r>
+      <w:r>
+        <w:t>A</w:t>
+      </w:r>
+    </w:p>
+    <w:p>
+      <w:r>
+        <w:rPr>
+          <w:vertAlign w:val="superscript"/>
+        </w:rPr>
+        <w:t>3</w:t>
+      </w:r>
+      <w:r>
+        <w:t xml:space="preserve"> Karolinska </w:t>
+      </w:r>
+      <w:proofErr w:type="spellStart"/>
+      <w:r>
+        <w:t>Institutet</w:t>
+      </w:r>
+      <w:proofErr w:type="spellEnd"/>
+      <w:r>
+        <w:t xml:space="preserve">, Department of Physiology &amp; Pharmacology, Section for Receptor Biology &amp; Signaling, </w:t>
+      </w:r>
+      <w:proofErr w:type="spellStart"/>
+      <w:r>
+        <w:t>Biomedicum</w:t>
+      </w:r>
+      <w:proofErr w:type="spellEnd"/>
+      <w:r>
+        <w:t>, S-172 65 Stockholm, Sweden</w:t>
+      </w:r>
+    </w:p>
+    <w:p/>
+    <w:p>
+      <w:r>
+        <w:t xml:space="preserve">* To whom correspondence should be addressed: </w:t>
+      </w:r>
+      <w:hyperlink r:id="rId5">
+        <w:r>
+          <w:rPr>
+            <w:rStyle w:val="Hyperlink"/>
+          </w:rPr>
+          <w:t>oadebali@sabanciuniv.edu</w:t>
+        </w:r>
+      </w:hyperlink>
+    </w:p>
+    <w:p>
+      <w:pPr>
+        <w:rPr>
+          <w:b/>
+        </w:rPr>
+      </w:pPr>
+      <w:r>
+        <w:rPr>
+          <w:b/>
+        </w:rPr>
+        <w:t xml:space="preserve">The PDF file </w:t>
+      </w:r>
+      <w:r>
+        <w:rPr>
+          <w:b/>
+        </w:rPr>
+        <w:t>includes:</w:t>
+      </w:r>
+    </w:p>
+    <w:p>
+      <w:pPr>
+        <w:ind w:left="720"/>
+      </w:pPr>
+      <w:r>
+        <w:t>Figs. S1 to S4</w:t>
+      </w:r>
+    </w:p>
+    <w:p>
+      <w:pPr>
+        <w:ind w:left="720"/>
+      </w:pPr>
+      <w:r>
+        <w:t>References</w:t>
+      </w:r>
+    </w:p>
+    <w:p>
+      <w:pPr>
         <w:pStyle w:val="Title"/>
-      </w:pPr>
-      <w:r>
+        <w:rPr>
+          <w:rFonts w:ascii="Arial" w:hAnsi="Arial" w:cs="Arial"/>
+        </w:rPr>
+      </w:pPr>
+    </w:p>
+    <w:p>
+      <w:pPr>
+        <w:pStyle w:val="Title"/>
+        <w:rPr>
+          <w:rFonts w:ascii="Arial" w:hAnsi="Arial" w:cs="Arial"/>
+        </w:rPr>
+      </w:pPr>
+    </w:p>
+    <w:p>
+      <w:pPr>
+        <w:pStyle w:val="Title"/>
+        <w:rPr>
+          <w:rFonts w:ascii="Arial" w:hAnsi="Arial" w:cs="Arial"/>
+        </w:rPr>
+      </w:pPr>
+    </w:p>
+    <w:p>
+      <w:pPr>
+        <w:pStyle w:val="Title"/>
+        <w:rPr>
+          <w:rFonts w:ascii="Arial" w:hAnsi="Arial" w:cs="Arial"/>
+        </w:rPr>
+      </w:pPr>
+      <w:r>
+        <w:rPr>
+          <w:rFonts w:ascii="Arial" w:hAnsi="Arial" w:cs="Arial"/>
+        </w:rPr>
+        <w:br w:type="page"/>
+      </w:r>
+    </w:p>
+    <w:p>
+      <w:pPr>
+        <w:pStyle w:val="Title"/>
+        <w:rPr>
+          <w:rFonts w:ascii="Arial" w:hAnsi="Arial" w:cs="Arial"/>
+        </w:rPr>
+      </w:pPr>
+      <w:r>
+        <w:rPr>
+          <w:rFonts w:ascii="Arial" w:hAnsi="Arial" w:cs="Arial"/>
+        </w:rPr>
+        <w:lastRenderedPageBreak/>
         <w:t>Supplementary Figures</w:t>
       </w:r>
     </w:p>
+    <w:p/>
     <w:p>
       <w:pPr>
         <w:pStyle w:val="Title"/>
-      </w:pPr>
-      <w:r>
-        <w:rPr>
+        <w:rPr>
+          <w:rFonts w:ascii="Arial" w:hAnsi="Arial" w:cs="Arial"/>
+        </w:rPr>
+      </w:pPr>
+      <w:r>
+        <w:rPr>
+          <w:rFonts w:ascii="Arial" w:hAnsi="Arial" w:cs="Arial"/>
           <w:noProof/>
         </w:rPr>
         <w:drawing>
-          <wp:inline distT="0" distB="0" distL="0" distR="0" wp14:anchorId="6AA70048" wp14:editId="6A97F1AF">
+          <wp:inline distT="0" distB="0" distL="0" distR="0" wp14:anchorId="58305A08" wp14:editId="51FAB8FA">
             <wp:extent cx="5930900" cy="5556738"/>
             <wp:effectExtent l="0" t="0" r="0" b="6350"/>
             <wp:docPr id="408585756" name="Picture 1" descr="A screenshot of a graph&#10;&#10;AI-generated content may be incorrect."/>
@@ -36,7 +301,7 @@
                     </pic:cNvPicPr>
                   </pic:nvPicPr>
                   <pic:blipFill rotWithShape="1">
-                    <a:blip r:embed="rId5" cstate="print">
+                    <a:blip r:embed="rId6" cstate="print">
                       <a:extLst>
                         <a:ext uri="{28A0092B-C50C-407E-A947-70E740481C1C}">
                           <a14:useLocalDpi xmlns:a14="http://schemas.microsoft.com/office/drawing/2010/main" val="0"/>
@@ -74,394 +339,302 @@
       </w:r>
     </w:p>
     <w:p>
-      <w:r>
-        <w:rPr>
+      <w:pPr>
+        <w:rPr>
+          <w:rFonts w:ascii="Arial" w:hAnsi="Arial" w:cs="Arial"/>
+        </w:rPr>
+      </w:pPr>
+      <w:r>
+        <w:rPr>
+          <w:rFonts w:ascii="Arial" w:hAnsi="Arial" w:cs="Arial"/>
           <w:b/>
           <w:bCs/>
         </w:rPr>
         <w:t xml:space="preserve">Figure S1: Individual benchmarking of class A-wide evolutionary patterns against deep mutational and alanine scanning experiments. </w:t>
       </w:r>
       <w:r>
-        <w:t>a.</w:t>
-      </w:r>
-      <w:r>
-        <w:t xml:space="preserve"> </w:t>
-      </w:r>
-      <w:r>
-        <w:t>For each residue, its mutational intolerance score</w:t>
-      </w:r>
-      <w:r>
-        <w:t xml:space="preserve"> </w:t>
-      </w:r>
-      <w:r>
-        <w:t xml:space="preserve">for </w:t>
-      </w:r>
-      <w:r>
-        <w:t>B2AR (</w:t>
-      </w:r>
-      <w:r>
-        <w:t>Beta-2 Adrenergic Receptor</w:t>
-      </w:r>
-      <w:r>
-        <w:t>)</w:t>
-      </w:r>
-      <w:r>
-        <w:t xml:space="preserve"> </w:t>
-      </w:r>
-      <w:r>
+        <w:rPr>
+          <w:rFonts w:ascii="Arial" w:hAnsi="Arial" w:cs="Arial"/>
+        </w:rPr>
+        <w:t xml:space="preserve">a. For each residue, its mutational intolerance score for B2AR (Beta-2 Adrenergic Receptor) </w:t>
+      </w:r>
+      <w:r>
+        <w:rPr>
+          <w:rFonts w:ascii="Arial" w:hAnsi="Arial" w:cs="Arial"/>
+        </w:rPr>
         <w:fldChar w:fldCharType="begin"/>
       </w:r>
       <w:r>
+        <w:rPr>
+          <w:rFonts w:ascii="Arial" w:hAnsi="Arial" w:cs="Arial"/>
+        </w:rPr>
         <w:instrText xml:space="preserve"> ADDIN EN.CITE &lt;EndNote&gt;&lt;Cite&gt;&lt;Author&gt;Jones&lt;/Author&gt;&lt;Year&gt;2020&lt;/Year&gt;&lt;RecNum&gt;31&lt;/RecNum&gt;&lt;DisplayText&gt;&lt;style face="superscript"&gt;1&lt;/style&gt;&lt;/DisplayText&gt;&lt;record&gt;&lt;rec-number&gt;31&lt;/rec-number&gt;&lt;foreign-keys&gt;&lt;key app="EN" db-id="vsszpv0srx2p07exar7x90f2e5wvvvxspaxr" timestamp="1674148044"&gt;31&lt;/key&gt;&lt;/foreign-keys&gt;&lt;ref-type name="Journal Article"&gt;17&lt;/ref-type&gt;&lt;contributors&gt;&lt;authors&gt;&lt;author&gt;Jones, Eric M.&lt;/author&gt;&lt;author&gt;Lubock, Nathan B.&lt;/author&gt;&lt;author&gt;Venkatakrishnan, Aj&lt;/author&gt;&lt;author&gt;Wang, Jeffrey&lt;/author&gt;&lt;author&gt;Tseng, Alex M.&lt;/author&gt;&lt;author&gt;Paggi, Joseph M.&lt;/author&gt;&lt;author&gt;Latorraca, Naomi R.&lt;/author&gt;&lt;author&gt;Cancilla, Daniel&lt;/author&gt;&lt;author&gt;Satyadi, Megan&lt;/author&gt;&lt;author&gt;Davis, Jessica E.&lt;/author&gt;&lt;author&gt;Babu, M. Madan&lt;/author&gt;&lt;author&gt;Dror, Ron O.&lt;/author&gt;&lt;author&gt;Kosuri, Sriram&lt;/author&gt;&lt;/authors&gt;&lt;/contributors&gt;&lt;titles&gt;&lt;title&gt;Structural and functional characterization of G protein–coupled receptors with deep mutational scanning&lt;/title&gt;&lt;secondary-title&gt;eLife&lt;/secondary-title&gt;&lt;/titles&gt;&lt;periodical&gt;&lt;full-title&gt;eLife&lt;/full-title&gt;&lt;/periodical&gt;&lt;volume&gt;9&lt;/volume&gt;&lt;dates&gt;&lt;year&gt;2020&lt;/year&gt;&lt;/dates&gt;&lt;publisher&gt;eLife Sciences Publications, Ltd&lt;/publisher&gt;&lt;isbn&gt;2050-084X&lt;/isbn&gt;&lt;urls&gt;&lt;related-urls&gt;&lt;url&gt;https://dx.doi.org/10.7554/eLife.54895&lt;/url&gt;&lt;/related-urls&gt;&lt;/urls&gt;&lt;electronic-resource-num&gt;10.7554/elife.54895&lt;/electronic-resource-num&gt;&lt;/record&gt;&lt;/Cite&gt;&lt;/EndNote&gt;</w:instrText>
       </w:r>
       <w:r>
+        <w:rPr>
+          <w:rFonts w:ascii="Arial" w:hAnsi="Arial" w:cs="Arial"/>
+        </w:rPr>
         <w:fldChar w:fldCharType="separate"/>
       </w:r>
       <w:r>
         <w:rPr>
+          <w:rFonts w:ascii="Arial" w:hAnsi="Arial" w:cs="Arial"/>
           <w:noProof/>
           <w:vertAlign w:val="superscript"/>
         </w:rPr>
         <w:t>1</w:t>
       </w:r>
       <w:r>
+        <w:rPr>
+          <w:rFonts w:ascii="Arial" w:hAnsi="Arial" w:cs="Arial"/>
+        </w:rPr>
         <w:fldChar w:fldCharType="end"/>
       </w:r>
       <w:r>
-        <w:t xml:space="preserve"> is mapped onto</w:t>
-      </w:r>
-      <w:r>
-        <w:t xml:space="preserve"> the</w:t>
-      </w:r>
-      <w:r>
-        <w:t xml:space="preserve"> class A scatter plot (Figure 2a)</w:t>
-      </w:r>
-      <w:r>
-        <w:t>.</w:t>
-      </w:r>
-      <w:r>
-        <w:t xml:space="preserve"> </w:t>
-      </w:r>
-      <w:r>
-        <w:t>C</w:t>
-      </w:r>
-      <w:r>
-        <w:t>olors represent decreasing mutational tolerance, ranging from grey</w:t>
-      </w:r>
-      <w:r>
-        <w:t xml:space="preserve"> (tolerant)</w:t>
-      </w:r>
-      <w:r>
-        <w:t xml:space="preserve"> through orange to red</w:t>
-      </w:r>
-      <w:r>
-        <w:t xml:space="preserve"> (highly intolerant)</w:t>
-      </w:r>
-      <w:r>
-        <w:t>.</w:t>
-      </w:r>
-      <w:r>
-        <w:t xml:space="preserve"> b. </w:t>
-      </w:r>
-      <w:r>
-        <w:t>Similar representation for m</w:t>
-      </w:r>
-      <w:r>
-        <w:t>utational sensitivity (inverse of</w:t>
-      </w:r>
-      <w:r>
-        <w:t xml:space="preserve"> tolerance) for MC4R (</w:t>
-      </w:r>
-      <w:r>
-        <w:t>Melanocortin 4 Receptor</w:t>
-      </w:r>
-      <w:r>
-        <w:t>)</w:t>
-      </w:r>
-      <w:r>
+        <w:rPr>
+          <w:rFonts w:ascii="Arial" w:hAnsi="Arial" w:cs="Arial"/>
+        </w:rPr>
+        <w:t xml:space="preserve"> is mapped onto the class A scatter plot (Figure 2a). Colors represent decreasing mutational tolerance, ranging from grey (tolerant) through orange to red (highly intolerant). b. Similar representation for mutational sensitivity (inverse of tolerance) for MC4R (Melanocortin 4 Receptor)</w:t>
+      </w:r>
+      <w:r>
+        <w:rPr>
+          <w:rFonts w:ascii="Arial" w:hAnsi="Arial" w:cs="Arial"/>
+        </w:rPr>
         <w:fldChar w:fldCharType="begin"/>
       </w:r>
       <w:r>
+        <w:rPr>
+          <w:rFonts w:ascii="Arial" w:hAnsi="Arial" w:cs="Arial"/>
+        </w:rPr>
         <w:instrText xml:space="preserve"> ADDIN EN.CITE &lt;EndNote&gt;&lt;Cite&gt;&lt;Author&gt;Howard&lt;/Author&gt;&lt;Year&gt;2025&lt;/Year&gt;&lt;RecNum&gt;441&lt;/RecNum&gt;&lt;DisplayText&gt;&lt;style face="superscript"&gt;2&lt;/style&gt;&lt;/DisplayText&gt;&lt;record&gt;&lt;rec-number&gt;441&lt;/rec-number&gt;&lt;foreign-keys&gt;&lt;key app="EN" db-id="vsszpv0srx2p07exar7x90f2e5wvvvxspaxr" timestamp="1763149974"&gt;441&lt;/key&gt;&lt;/foreign-keys&gt;&lt;ref-type name="Unpublished Work"&gt;34&lt;/ref-type&gt;&lt;contributors&gt;&lt;authors&gt;&lt;author&gt;Howard, Conor J.&lt;/author&gt;&lt;author&gt;Abell, Nathan S.&lt;/author&gt;&lt;author&gt;Osuna, Beatriz A.&lt;/author&gt;&lt;author&gt;Jones, Eric M.&lt;/author&gt;&lt;author&gt;Chan, Leon Y.&lt;/author&gt;&lt;author&gt;Chan, Henry&lt;/author&gt;&lt;author&gt;Artis, Dean R.&lt;/author&gt;&lt;author&gt;Asfaha, Jonathan B.&lt;/author&gt;&lt;author&gt;Bloom, Joshua S.&lt;/author&gt;&lt;author&gt;Cooper, Aaron R.&lt;/author&gt;&lt;author&gt;Liao, Andrew&lt;/author&gt;&lt;author&gt;Mahdavi, Eden&lt;/author&gt;&lt;author&gt;Mohammed, Nabil&lt;/author&gt;&lt;author&gt;Su, Alan L.&lt;/author&gt;&lt;author&gt;Uribe, Giselle A.&lt;/author&gt;&lt;author&gt;Kosuri, Sriram&lt;/author&gt;&lt;author&gt;Dickel, Diane E.&lt;/author&gt;&lt;author&gt;Lubock, Nathan B.&lt;/author&gt;&lt;/authors&gt;&lt;/contributors&gt;&lt;titles&gt;&lt;title&gt;High resolution deep mutational scanning of the melanocortin-4 receptor enables target characterization for drug discovery&lt;/title&gt;&lt;/titles&gt;&lt;dates&gt;&lt;year&gt;2025&lt;/year&gt;&lt;/dates&gt;&lt;publisher&gt;eLife Sciences Publications, Ltd&lt;/publisher&gt;&lt;urls&gt;&lt;related-urls&gt;&lt;url&gt;https://dx.doi.org/10.7554/eLife.104725.2&lt;/url&gt;&lt;/related-urls&gt;&lt;/urls&gt;&lt;electronic-resource-num&gt;10.7554/elife.104725.2&lt;/electronic-resource-num&gt;&lt;/record&gt;&lt;/Cite&gt;&lt;/EndNote&gt;</w:instrText>
       </w:r>
       <w:r>
+        <w:rPr>
+          <w:rFonts w:ascii="Arial" w:hAnsi="Arial" w:cs="Arial"/>
+        </w:rPr>
         <w:fldChar w:fldCharType="separate"/>
       </w:r>
       <w:r>
         <w:rPr>
+          <w:rFonts w:ascii="Arial" w:hAnsi="Arial" w:cs="Arial"/>
           <w:noProof/>
           <w:vertAlign w:val="superscript"/>
         </w:rPr>
         <w:t>2</w:t>
       </w:r>
       <w:r>
+        <w:rPr>
+          <w:rFonts w:ascii="Arial" w:hAnsi="Arial" w:cs="Arial"/>
+        </w:rPr>
         <w:fldChar w:fldCharType="end"/>
       </w:r>
       <w:r>
-        <w:t xml:space="preserve"> with similar coloring. </w:t>
-      </w:r>
-      <w:r>
-        <w:t>c. Mutational tolerance of GPR68 (</w:t>
-      </w:r>
-      <w:r>
-        <w:t xml:space="preserve">Proton-sensing G-protein </w:t>
-      </w:r>
-      <w:r>
-        <w:t>C</w:t>
-      </w:r>
-      <w:r>
-        <w:t xml:space="preserve">oupled </w:t>
-      </w:r>
-      <w:r>
-        <w:t>R</w:t>
-      </w:r>
-      <w:r>
-        <w:t>eceptor</w:t>
-      </w:r>
-      <w:r>
-        <w:t>)</w:t>
-      </w:r>
-      <w:r>
+        <w:rPr>
+          <w:rFonts w:ascii="Arial" w:hAnsi="Arial" w:cs="Arial"/>
+        </w:rPr>
+        <w:t xml:space="preserve"> with similar coloring. c. Mutational tolerance of GPR68 (Proton-sensing G-protein Coupled Receptor)</w:t>
+      </w:r>
+      <w:r>
+        <w:rPr>
+          <w:rFonts w:ascii="Arial" w:hAnsi="Arial" w:cs="Arial"/>
+        </w:rPr>
         <w:fldChar w:fldCharType="begin"/>
       </w:r>
       <w:r>
+        <w:rPr>
+          <w:rFonts w:ascii="Arial" w:hAnsi="Arial" w:cs="Arial"/>
+        </w:rPr>
         <w:instrText xml:space="preserve"> ADDIN EN.CITE &lt;EndNote&gt;&lt;Cite&gt;&lt;Author&gt;Howard&lt;/Author&gt;&lt;Year&gt;2025&lt;/Year&gt;&lt;RecNum&gt;440&lt;/RecNum&gt;&lt;DisplayText&gt;&lt;style face="superscript"&gt;3&lt;/style&gt;&lt;/DisplayText&gt;&lt;record&gt;&lt;rec-number&gt;440&lt;/rec-number&gt;&lt;foreign-keys&gt;&lt;key app="EN" db-id="vsszpv0srx2p07exar7x90f2e5wvvvxspaxr" timestamp="1763149906"&gt;440&lt;/key&gt;&lt;/foreign-keys&gt;&lt;ref-type name="Journal Article"&gt;17&lt;/ref-type&gt;&lt;contributors&gt;&lt;authors&gt;&lt;author&gt;Howard, Matthew K.&lt;/author&gt;&lt;author&gt;Hoppe, Nicholas&lt;/author&gt;&lt;author&gt;Huang, Xi-Ping&lt;/author&gt;&lt;author&gt;Mitrovic, Darko&lt;/author&gt;&lt;author&gt;Billesbølle, Christian B.&lt;/author&gt;&lt;author&gt;Macdonald, Christian B.&lt;/author&gt;&lt;author&gt;Mehrotra, Eshan&lt;/author&gt;&lt;author&gt;Rockefeller Grimes, Patrick&lt;/author&gt;&lt;author&gt;Trinidad, Donovan D.&lt;/author&gt;&lt;author&gt;Delemotte, Lucie&lt;/author&gt;&lt;author&gt;English, Justin G.&lt;/author&gt;&lt;author&gt;Coyote-Maestas, Willow&lt;/author&gt;&lt;author&gt;Manglik, Aashish&lt;/author&gt;&lt;/authors&gt;&lt;/contributors&gt;&lt;titles&gt;&lt;title&gt;Molecular basis of proton sensing by G protein-coupled receptors&lt;/title&gt;&lt;secondary-title&gt;Cell&lt;/secondary-title&gt;&lt;/titles&gt;&lt;periodical&gt;&lt;full-title&gt;Cell&lt;/full-title&gt;&lt;/periodical&gt;&lt;pages&gt;671-687.e20&lt;/pages&gt;&lt;volume&gt;188&lt;/volume&gt;&lt;number&gt;3&lt;/number&gt;&lt;keywords&gt;&lt;keyword&gt;GPCR&lt;/keyword&gt;&lt;keyword&gt;proton sensing&lt;/keyword&gt;&lt;keyword&gt;proton&lt;/keyword&gt;&lt;keyword&gt;signaling&lt;/keyword&gt;&lt;keyword&gt;structure&lt;/keyword&gt;&lt;keyword&gt;cryo-EM&lt;/keyword&gt;&lt;/keywords&gt;&lt;dates&gt;&lt;year&gt;2025&lt;/year&gt;&lt;pub-dates&gt;&lt;date&gt;2025/02/06/&lt;/date&gt;&lt;/pub-dates&gt;&lt;/dates&gt;&lt;isbn&gt;0092-8674&lt;/isbn&gt;&lt;urls&gt;&lt;related-urls&gt;&lt;url&gt;https://www.sciencedirect.com/science/article/pii/S0092867424013734&lt;/url&gt;&lt;/related-urls&gt;&lt;/urls&gt;&lt;electronic-resource-num&gt;https://doi.org/10.1016/j.cell.2024.11.036&lt;/electronic-resource-num&gt;&lt;/record&gt;&lt;/Cite&gt;&lt;/EndNote&gt;</w:instrText>
       </w:r>
       <w:r>
+        <w:rPr>
+          <w:rFonts w:ascii="Arial" w:hAnsi="Arial" w:cs="Arial"/>
+        </w:rPr>
         <w:fldChar w:fldCharType="separate"/>
       </w:r>
       <w:r>
         <w:rPr>
+          <w:rFonts w:ascii="Arial" w:hAnsi="Arial" w:cs="Arial"/>
           <w:noProof/>
           <w:vertAlign w:val="superscript"/>
         </w:rPr>
         <w:t>3</w:t>
       </w:r>
       <w:r>
+        <w:rPr>
+          <w:rFonts w:ascii="Arial" w:hAnsi="Arial" w:cs="Arial"/>
+        </w:rPr>
         <w:fldChar w:fldCharType="end"/>
       </w:r>
       <w:r>
-        <w:t xml:space="preserve"> was illustrated with similar coloring.</w:t>
-      </w:r>
-      <w:r>
-        <w:t xml:space="preserve"> </w:t>
-      </w:r>
-      <w:r>
-        <w:t>d.</w:t>
-      </w:r>
-      <w:r>
-        <w:t xml:space="preserve"> Mutational tolerance calculated based on surface expression of V2R (</w:t>
-      </w:r>
-      <w:r>
-        <w:t>V</w:t>
-      </w:r>
-      <w:r>
-        <w:t xml:space="preserve">asopressin 2 </w:t>
-      </w:r>
-      <w:r>
-        <w:t>R</w:t>
-      </w:r>
-      <w:r>
-        <w:t>eceptor</w:t>
-      </w:r>
-      <w:r>
-        <w:t>)</w:t>
-      </w:r>
-      <w:r>
+        <w:rPr>
+          <w:rFonts w:ascii="Arial" w:hAnsi="Arial" w:cs="Arial"/>
+        </w:rPr>
+        <w:t xml:space="preserve"> was illustrated with similar coloring. d. Mutational tolerance calculated based on surface expression of V2R (Vasopressin 2 Receptor)</w:t>
+      </w:r>
+      <w:r>
+        <w:rPr>
+          <w:rFonts w:ascii="Arial" w:hAnsi="Arial" w:cs="Arial"/>
+        </w:rPr>
         <w:fldChar w:fldCharType="begin"/>
       </w:r>
       <w:r>
+        <w:rPr>
+          <w:rFonts w:ascii="Arial" w:hAnsi="Arial" w:cs="Arial"/>
+        </w:rPr>
         <w:instrText xml:space="preserve"> ADDIN EN.CITE &lt;EndNote&gt;&lt;Cite&gt;&lt;Author&gt;Mighell&lt;/Author&gt;&lt;Year&gt;2025&lt;/Year&gt;&lt;RecNum&gt;439&lt;/RecNum&gt;&lt;DisplayText&gt;&lt;style face="superscript"&gt;4&lt;/style&gt;&lt;/DisplayText&gt;&lt;record&gt;&lt;rec-number&gt;439&lt;/rec-number&gt;&lt;foreign-keys&gt;&lt;key app="EN" db-id="vsszpv0srx2p07exar7x90f2e5wvvvxspaxr" timestamp="1763149763"&gt;439&lt;/key&gt;&lt;/foreign-keys&gt;&lt;ref-type name="Journal Article"&gt;17&lt;/ref-type&gt;&lt;contributors&gt;&lt;authors&gt;&lt;author&gt;Mighell, Taylor L.&lt;/author&gt;&lt;author&gt;Lehner, Ben&lt;/author&gt;&lt;/authors&gt;&lt;/contributors&gt;&lt;titles&gt;&lt;title&gt;A small molecule stabilizer rescues the surface expression of nearly all missense variants in a GPCR&lt;/title&gt;&lt;secondary-title&gt;Nature Structural &amp;amp; Molecular Biology&lt;/secondary-title&gt;&lt;/titles&gt;&lt;periodical&gt;&lt;full-title&gt;Nature Structural &amp;amp; Molecular Biology&lt;/full-title&gt;&lt;/periodical&gt;&lt;dates&gt;&lt;year&gt;2025&lt;/year&gt;&lt;pub-dates&gt;&lt;date&gt;2025/09/22&lt;/date&gt;&lt;/pub-dates&gt;&lt;/dates&gt;&lt;isbn&gt;1545-9985&lt;/isbn&gt;&lt;urls&gt;&lt;related-urls&gt;&lt;url&gt;https://doi.org/10.1038/s41594-025-01659-6&lt;/url&gt;&lt;/related-urls&gt;&lt;/urls&gt;&lt;electronic-resource-num&gt;10.1038/s41594-025-01659-6&lt;/electronic-resource-num&gt;&lt;/record&gt;&lt;/Cite&gt;&lt;/EndNote&gt;</w:instrText>
       </w:r>
       <w:r>
+        <w:rPr>
+          <w:rFonts w:ascii="Arial" w:hAnsi="Arial" w:cs="Arial"/>
+        </w:rPr>
         <w:fldChar w:fldCharType="separate"/>
       </w:r>
       <w:r>
         <w:rPr>
+          <w:rFonts w:ascii="Arial" w:hAnsi="Arial" w:cs="Arial"/>
           <w:noProof/>
           <w:vertAlign w:val="superscript"/>
         </w:rPr>
         <w:t>4</w:t>
       </w:r>
       <w:r>
+        <w:rPr>
+          <w:rFonts w:ascii="Arial" w:hAnsi="Arial" w:cs="Arial"/>
+        </w:rPr>
         <w:fldChar w:fldCharType="end"/>
       </w:r>
       <w:r>
-        <w:t>.</w:t>
-      </w:r>
-      <w:r>
-        <w:t xml:space="preserve"> </w:t>
-      </w:r>
-      <w:r>
-        <w:t>e</w:t>
-      </w:r>
-      <w:r>
-        <w:t>-d</w:t>
-      </w:r>
-      <w:r>
-        <w:t xml:space="preserve">. Mutational tolerance calculated based </w:t>
-      </w:r>
-      <w:r>
-        <w:t>on B2AR activa</w:t>
-      </w:r>
-      <w:r>
-        <w:rPr>
-          <w:noProof/>
+        <w:rPr>
+          <w:rFonts w:ascii="Arial" w:hAnsi="Arial" w:cs="Arial"/>
+        </w:rPr>
+        <w:t xml:space="preserve">. e-d. </w:t>
+      </w:r>
+      <w:r>
+        <w:rPr>
+          <w:rFonts w:ascii="Arial" w:hAnsi="Arial" w:cs="Arial"/>
         </w:rPr>
         <w:lastRenderedPageBreak/>
-        <w:drawing>
-          <wp:inline distT="0" distB="0" distL="0" distR="0" wp14:anchorId="10AFD18C" wp14:editId="3D608F36">
-            <wp:extent cx="5934710" cy="2577465"/>
-            <wp:effectExtent l="0" t="0" r="8890" b="0"/>
-            <wp:docPr id="1040931690" name="Picture 1"/>
-            <wp:cNvGraphicFramePr>
-              <a:graphicFrameLocks xmlns:a="http://schemas.openxmlformats.org/drawingml/2006/main" noChangeAspect="1"/>
-            </wp:cNvGraphicFramePr>
-            <a:graphic xmlns:a="http://schemas.openxmlformats.org/drawingml/2006/main">
-              <a:graphicData uri="http://schemas.openxmlformats.org/drawingml/2006/picture">
-                <pic:pic xmlns:pic="http://schemas.openxmlformats.org/drawingml/2006/picture">
-                  <pic:nvPicPr>
-                    <pic:cNvPr id="0" name="Picture 1"/>
-                    <pic:cNvPicPr>
-                      <a:picLocks noChangeAspect="1" noChangeArrowheads="1"/>
-                    </pic:cNvPicPr>
-                  </pic:nvPicPr>
-                  <pic:blipFill>
-                    <a:blip r:embed="rId6" cstate="print">
-                      <a:extLst>
-                        <a:ext uri="{28A0092B-C50C-407E-A947-70E740481C1C}">
-                          <a14:useLocalDpi xmlns:a14="http://schemas.microsoft.com/office/drawing/2010/main" val="0"/>
-                        </a:ext>
-                      </a:extLst>
-                    </a:blip>
-                    <a:srcRect/>
-                    <a:stretch>
-                      <a:fillRect/>
-                    </a:stretch>
-                  </pic:blipFill>
-                  <pic:spPr bwMode="auto">
-                    <a:xfrm>
-                      <a:off x="0" y="0"/>
-                      <a:ext cx="5934710" cy="2577465"/>
-                    </a:xfrm>
-                    <a:prstGeom prst="rect">
-                      <a:avLst/>
-                    </a:prstGeom>
-                    <a:noFill/>
-                    <a:ln>
-                      <a:noFill/>
-                    </a:ln>
-                  </pic:spPr>
-                </pic:pic>
-              </a:graphicData>
-            </a:graphic>
-          </wp:inline>
-        </w:drawing>
-      </w:r>
-      <w:r>
-        <w:t xml:space="preserve">tion against G protein and </w:t>
-      </w:r>
-      <w:r>
-        <w:t>Beta-arrestin activity.</w:t>
-      </w:r>
-      <w:r>
+        <w:t>Mutational tolerance calculated based on B2AR activation against G protein and Beta-</w:t>
+      </w:r>
+      <w:proofErr w:type="spellStart"/>
+      <w:r>
+        <w:rPr>
+          <w:rFonts w:ascii="Arial" w:hAnsi="Arial" w:cs="Arial"/>
+        </w:rPr>
+        <w:t>arrestin</w:t>
+      </w:r>
+      <w:proofErr w:type="spellEnd"/>
+      <w:r>
+        <w:rPr>
+          <w:rFonts w:ascii="Arial" w:hAnsi="Arial" w:cs="Arial"/>
+        </w:rPr>
+        <w:t xml:space="preserve"> activity.</w:t>
+      </w:r>
+      <w:r>
+        <w:rPr>
+          <w:rFonts w:ascii="Arial" w:hAnsi="Arial" w:cs="Arial"/>
+        </w:rPr>
         <w:fldChar w:fldCharType="begin"/>
       </w:r>
       <w:r>
+        <w:rPr>
+          <w:rFonts w:ascii="Arial" w:hAnsi="Arial" w:cs="Arial"/>
+        </w:rPr>
         <w:instrText xml:space="preserve"> ADDIN EN.CITE &lt;EndNote&gt;&lt;Cite&gt;&lt;Author&gt;Mighell&lt;/Author&gt;&lt;Year&gt;2025&lt;/Year&gt;&lt;RecNum&gt;442&lt;/RecNum&gt;&lt;DisplayText&gt;&lt;style face="superscript"&gt;5&lt;/style&gt;&lt;/DisplayText&gt;&lt;record&gt;&lt;rec-number&gt;442&lt;/rec-number&gt;&lt;foreign-keys&gt;&lt;key app="EN" db-id="vsszpv0srx2p07exar7x90f2e5wvvvxspaxr" timestamp="1763150156"&gt;442&lt;/key&gt;&lt;/foreign-keys&gt;&lt;ref-type name="Unpublished Work"&gt;34&lt;/ref-type&gt;&lt;contributors&gt;&lt;authors&gt;&lt;author&gt;Mighell, Taylor L.&lt;/author&gt;&lt;author&gt;Lehner, Ben&lt;/author&gt;&lt;/authors&gt;&lt;/contributors&gt;&lt;titles&gt;&lt;title&gt;The genetic architecture of G-protein coupled receptor signaling&lt;/title&gt;&lt;/titles&gt;&lt;dates&gt;&lt;year&gt;2025&lt;/year&gt;&lt;/dates&gt;&lt;publisher&gt;Cold Spring Harbor Laboratory&lt;/publisher&gt;&lt;urls&gt;&lt;related-urls&gt;&lt;url&gt;https://dx.doi.org/10.1101/2025.05.30.656974&lt;/url&gt;&lt;/related-urls&gt;&lt;/urls&gt;&lt;electronic-resource-num&gt;10.1101/2025.05.30.656974&lt;/electronic-resource-num&gt;&lt;/record&gt;&lt;/Cite&gt;&lt;/EndNote&gt;</w:instrText>
       </w:r>
       <w:r>
+        <w:rPr>
+          <w:rFonts w:ascii="Arial" w:hAnsi="Arial" w:cs="Arial"/>
+        </w:rPr>
         <w:fldChar w:fldCharType="separate"/>
       </w:r>
       <w:r>
         <w:rPr>
+          <w:rFonts w:ascii="Arial" w:hAnsi="Arial" w:cs="Arial"/>
           <w:noProof/>
           <w:vertAlign w:val="superscript"/>
         </w:rPr>
         <w:t>5</w:t>
       </w:r>
       <w:r>
+        <w:rPr>
+          <w:rFonts w:ascii="Arial" w:hAnsi="Arial" w:cs="Arial"/>
+        </w:rPr>
         <w:fldChar w:fldCharType="end"/>
       </w:r>
       <w:r>
-        <w:t xml:space="preserve"> g-h. Increase</w:t>
-      </w:r>
-      <w:r>
-        <w:t>s</w:t>
-      </w:r>
-      <w:r>
-        <w:t xml:space="preserve"> or decrease</w:t>
-      </w:r>
-      <w:r>
-        <w:t>s</w:t>
-      </w:r>
-      <w:r>
-        <w:t xml:space="preserve"> in </w:t>
-      </w:r>
-      <w:r>
-        <w:t>potency and efficacy are labeled for</w:t>
-      </w:r>
-      <w:r>
-        <w:t xml:space="preserve"> B2AR in respons</w:t>
-      </w:r>
-      <w:r>
-        <w:t>e</w:t>
-      </w:r>
-      <w:r>
-        <w:t xml:space="preserve"> to alanine scanning</w:t>
-      </w:r>
-      <w:r>
+        <w:rPr>
+          <w:rFonts w:ascii="Arial" w:hAnsi="Arial" w:cs="Arial"/>
+        </w:rPr>
+        <w:t xml:space="preserve"> g-h. Increases or decreases in potency and efficacy are labeled for B2AR in response to alanine scanning</w:t>
+      </w:r>
+      <w:r>
+        <w:rPr>
+          <w:rFonts w:ascii="Arial" w:hAnsi="Arial" w:cs="Arial"/>
+        </w:rPr>
         <w:fldChar w:fldCharType="begin"/>
       </w:r>
       <w:r>
+        <w:rPr>
+          <w:rFonts w:ascii="Arial" w:hAnsi="Arial" w:cs="Arial"/>
+        </w:rPr>
         <w:instrText xml:space="preserve"> ADDIN EN.CITE &lt;EndNote&gt;&lt;Cite&gt;&lt;Author&gt;Heydenreich&lt;/Author&gt;&lt;Year&gt;2023&lt;/Year&gt;&lt;RecNum&gt;445&lt;/RecNum&gt;&lt;DisplayText&gt;&lt;style face="superscript"&gt;6&lt;/style&gt;&lt;/DisplayText&gt;&lt;record&gt;&lt;rec-number&gt;445&lt;/rec-number&gt;&lt;foreign-keys&gt;&lt;key app="EN" db-id="vsszpv0srx2p07exar7x90f2e5wvvvxspaxr" timestamp="1764532093"&gt;445&lt;/key&gt;&lt;/foreign-keys&gt;&lt;ref-type name="Journal Article"&gt;17&lt;/ref-type&gt;&lt;contributors&gt;&lt;authors&gt;&lt;author&gt;Heydenreich, Franziska M.&lt;/author&gt;&lt;author&gt;Marti-Solano, Maria&lt;/author&gt;&lt;author&gt;Sandhu, Manbir&lt;/author&gt;&lt;author&gt;Kobilka, Brian K.&lt;/author&gt;&lt;author&gt;Bouvier, Michel&lt;/author&gt;&lt;author&gt;Babu, M. Madan&lt;/author&gt;&lt;/authors&gt;&lt;/contributors&gt;&lt;titles&gt;&lt;title&gt;Molecular determinants of ligand efficacy and potency in GPCR signaling&lt;/title&gt;&lt;secondary-title&gt;Science&lt;/secondary-title&gt;&lt;/titles&gt;&lt;periodical&gt;&lt;full-title&gt;Science&lt;/full-title&gt;&lt;/periodical&gt;&lt;pages&gt;eadh1859&lt;/pages&gt;&lt;volume&gt;382&lt;/volume&gt;&lt;number&gt;6677&lt;/number&gt;&lt;dates&gt;&lt;year&gt;2023&lt;/year&gt;&lt;/dates&gt;&lt;urls&gt;&lt;related-urls&gt;&lt;url&gt;https://www.science.org/doi/abs/10.1126/science.adh1859&lt;/url&gt;&lt;/related-urls&gt;&lt;/urls&gt;&lt;electronic-resource-num&gt;doi:10.1126/science.adh1859&lt;/electronic-resource-num&gt;&lt;/record&gt;&lt;/Cite&gt;&lt;/EndNote&gt;</w:instrText>
       </w:r>
       <w:r>
+        <w:rPr>
+          <w:rFonts w:ascii="Arial" w:hAnsi="Arial" w:cs="Arial"/>
+        </w:rPr>
         <w:fldChar w:fldCharType="separate"/>
       </w:r>
       <w:r>
         <w:rPr>
+          <w:rFonts w:ascii="Arial" w:hAnsi="Arial" w:cs="Arial"/>
           <w:noProof/>
           <w:vertAlign w:val="superscript"/>
         </w:rPr>
         <w:t>6</w:t>
       </w:r>
       <w:r>
+        <w:rPr>
+          <w:rFonts w:ascii="Arial" w:hAnsi="Arial" w:cs="Arial"/>
+        </w:rPr>
         <w:fldChar w:fldCharType="end"/>
       </w:r>
       <w:r>
-        <w:t>.</w:t>
-      </w:r>
-      <w:r>
-        <w:t xml:space="preserve"> Alanine scanning data is not used for the main text, but added as an additional benchmarking.</w:t>
-      </w:r>
-      <w:r>
-        <w:t xml:space="preserve"> </w:t>
-      </w:r>
-      <w:r>
-        <w:t xml:space="preserve">i-j Actual measurements </w:t>
-      </w:r>
-      <w:r>
-        <w:t xml:space="preserve">for efficacy and potency </w:t>
-      </w:r>
-      <w:r>
-        <w:t xml:space="preserve">are mapped </w:t>
-      </w:r>
-      <w:r>
-        <w:t>on to class A scatter plot.</w:t>
-      </w:r>
-      <w:r>
-        <w:t xml:space="preserve"> </w:t>
-      </w:r>
-    </w:p>
-    <w:p>
-      <w:r>
-        <w:rPr>
+        <w:rPr>
+          <w:rFonts w:ascii="Arial" w:hAnsi="Arial" w:cs="Arial"/>
+        </w:rPr>
+        <w:t xml:space="preserve">. Alanine scanning data is not used for the main text, but added as an additional benchmarking. </w:t>
+      </w:r>
+      <w:proofErr w:type="spellStart"/>
+      <w:r>
+        <w:rPr>
+          <w:rFonts w:ascii="Arial" w:hAnsi="Arial" w:cs="Arial"/>
+        </w:rPr>
+        <w:t>i</w:t>
+      </w:r>
+      <w:proofErr w:type="spellEnd"/>
+      <w:r>
+        <w:rPr>
+          <w:rFonts w:ascii="Arial" w:hAnsi="Arial" w:cs="Arial"/>
+        </w:rPr>
+        <w:t xml:space="preserve">-j Actual measurements for efficacy and potency are mapped on to class A scatter plot.  </w:t>
+      </w:r>
+    </w:p>
+    <w:p>
+      <w:pPr>
+        <w:rPr>
+          <w:rFonts w:ascii="Arial" w:hAnsi="Arial" w:cs="Arial"/>
+        </w:rPr>
+      </w:pPr>
+      <w:r>
+        <w:rPr>
+          <w:rFonts w:ascii="Arial" w:hAnsi="Arial" w:cs="Arial"/>
           <w:noProof/>
         </w:rPr>
-        <w:lastRenderedPageBreak/>
         <w:drawing>
-          <wp:inline distT="0" distB="0" distL="0" distR="0" wp14:anchorId="4697A41E" wp14:editId="1D16B27F">
+          <wp:inline distT="0" distB="0" distL="0" distR="0" wp14:anchorId="1A972105" wp14:editId="32DA7A42">
             <wp:extent cx="5928360" cy="6344920"/>
             <wp:effectExtent l="0" t="0" r="0" b="0"/>
             <wp:docPr id="135085246" name="Picture 6"/>
@@ -510,16 +683,34 @@
         </w:drawing>
       </w:r>
     </w:p>
-    <w:p/>
-    <w:p/>
-    <w:p>
-      <w:r>
-        <w:rPr>
+    <w:p>
+      <w:pPr>
+        <w:rPr>
+          <w:rFonts w:ascii="Arial" w:hAnsi="Arial" w:cs="Arial"/>
+        </w:rPr>
+      </w:pPr>
+    </w:p>
+    <w:p>
+      <w:pPr>
+        <w:rPr>
+          <w:rFonts w:ascii="Arial" w:hAnsi="Arial" w:cs="Arial"/>
+        </w:rPr>
+      </w:pPr>
+    </w:p>
+    <w:p>
+      <w:pPr>
+        <w:rPr>
+          <w:rFonts w:ascii="Arial" w:hAnsi="Arial" w:cs="Arial"/>
+        </w:rPr>
+      </w:pPr>
+      <w:r>
+        <w:rPr>
+          <w:rFonts w:ascii="Arial" w:hAnsi="Arial" w:cs="Arial"/>
           <w:noProof/>
         </w:rPr>
         <w:lastRenderedPageBreak/>
         <w:drawing>
-          <wp:inline distT="0" distB="0" distL="0" distR="0" wp14:anchorId="38F4FA1C" wp14:editId="457190A5">
+          <wp:inline distT="0" distB="0" distL="0" distR="0" wp14:anchorId="02910DB9" wp14:editId="11C81A39">
             <wp:extent cx="5928360" cy="6344920"/>
             <wp:effectExtent l="0" t="0" r="0" b="0"/>
             <wp:docPr id="1798611393" name="Picture 7"/>
@@ -569,66 +760,24 @@
       </w:r>
     </w:p>
     <w:p>
-      <w:r>
-        <w:rPr>
+      <w:pPr>
+        <w:rPr>
+          <w:rFonts w:ascii="Arial" w:hAnsi="Arial" w:cs="Arial"/>
+        </w:rPr>
+      </w:pPr>
+      <w:r>
+        <w:rPr>
+          <w:rFonts w:ascii="Arial" w:hAnsi="Arial" w:cs="Arial"/>
           <w:b/>
           <w:bCs/>
         </w:rPr>
-        <w:t>Figure S2: Correlation of class A</w:t>
-      </w:r>
-      <w:r>
-        <w:rPr>
-          <w:b/>
-          <w:bCs/>
-        </w:rPr>
-        <w:t>-</w:t>
-      </w:r>
-      <w:r>
-        <w:rPr>
-          <w:b/>
-          <w:bCs/>
-        </w:rPr>
-        <w:t>wide evolutionary metrics with mutational </w:t>
-      </w:r>
-      <w:r>
-        <w:rPr>
-          <w:b/>
-          <w:bCs/>
-        </w:rPr>
-        <w:t xml:space="preserve">tolerance </w:t>
-      </w:r>
-      <w:r>
-        <w:rPr>
-          <w:b/>
-          <w:bCs/>
-        </w:rPr>
-        <w:t xml:space="preserve">and </w:t>
-      </w:r>
-      <w:r>
-        <w:rPr>
-          <w:b/>
-          <w:bCs/>
-        </w:rPr>
-        <w:t>pathogenicity</w:t>
-      </w:r>
-      <w:r>
-        <w:rPr>
-          <w:b/>
-          <w:bCs/>
-        </w:rPr>
-        <w:t>.</w:t>
-      </w:r>
-      <w:r>
-        <w:t> </w:t>
-      </w:r>
-      <w:r>
-        <w:t>a.</w:t>
-      </w:r>
-      <w:r>
-        <w:t xml:space="preserve"> </w:t>
-      </w:r>
-      <w:r>
-        <w:t>Correlation summary table reporting Pearson r, p</w:t>
+        <w:t>Figure S2: Correlation of class A-wide evolutionary metrics with mutational tolerance and pathogenicity.</w:t>
+      </w:r>
+      <w:r>
+        <w:rPr>
+          <w:rFonts w:ascii="Arial" w:hAnsi="Arial" w:cs="Arial"/>
+        </w:rPr>
+        <w:t> a. Correlation summary table reporting Pearson r, p</w:t>
       </w:r>
       <w:r>
         <w:rPr>
@@ -637,10 +786,10 @@
         <w:t>‑</w:t>
       </w:r>
       <w:r>
-        <w:t xml:space="preserve">values and sample sizes for relationships between class A conservation or entropy at highly conserved sites and the indicated quantitative metrics. </w:t>
-      </w:r>
-      <w:r>
-        <w:t>Correlation summary table reporting Pearson r, p</w:t>
+        <w:rPr>
+          <w:rFonts w:ascii="Arial" w:hAnsi="Arial" w:cs="Arial"/>
+        </w:rPr>
+        <w:t>values and sample sizes for relationships between class A conservation or entropy at highly conserved sites and the indicated quantitative metrics. Correlation summary table reporting Pearson r, p</w:t>
       </w:r>
       <w:r>
         <w:rPr>
@@ -649,47 +798,31 @@
         <w:t>‑</w:t>
       </w:r>
       <w:r>
-        <w:t>values and sample sizes for relationships between class A conservation or entropy at highly conserved sites and the indicated quantitative metrics. b</w:t>
-      </w:r>
-      <w:r>
-        <w:rPr>
-          <w:rFonts w:ascii="Aptos" w:hAnsi="Aptos" w:cs="Aptos"/>
-        </w:rPr>
-        <w:t>-</w:t>
-      </w:r>
-      <w:r>
-        <w:t>c. Correlation of B2AR mutational tolerance with conservation and entropy. d</w:t>
-      </w:r>
-      <w:r>
-        <w:rPr>
-          <w:rFonts w:ascii="Aptos" w:hAnsi="Aptos" w:cs="Aptos"/>
-        </w:rPr>
-        <w:t>-</w:t>
-      </w:r>
-      <w:r>
-        <w:t>e. Correlation of MC4R mutational sensitivity with conservation and entropy. f</w:t>
-      </w:r>
-      <w:r>
-        <w:rPr>
-          <w:rFonts w:ascii="Aptos" w:hAnsi="Aptos" w:cs="Aptos"/>
-        </w:rPr>
-        <w:t>-</w:t>
-      </w:r>
-      <w:r>
-        <w:t xml:space="preserve">g. Correlation of GPR68 mutational tolerance at </w:t>
-      </w:r>
-      <w:r>
+        <w:rPr>
+          <w:rFonts w:ascii="Arial" w:hAnsi="Arial" w:cs="Arial"/>
+        </w:rPr>
+        <w:t xml:space="preserve">values and sample sizes for relationships between class A conservation or entropy at highly conserved sites and the indicated quantitative metrics. b-c. Correlation of B2AR mutational tolerance with conservation and entropy. d-e. Correlation of MC4R mutational sensitivity with conservation and </w:t>
+      </w:r>
+      <w:r>
+        <w:rPr>
+          <w:rFonts w:ascii="Arial" w:hAnsi="Arial" w:cs="Arial"/>
+        </w:rPr>
         <w:lastRenderedPageBreak/>
-        <w:t>pH 5.5 with conservation and entropy. h</w:t>
-      </w:r>
-      <w:r>
-        <w:rPr>
-          <w:rFonts w:ascii="Aptos" w:hAnsi="Aptos" w:cs="Aptos"/>
-        </w:rPr>
-        <w:t>-</w:t>
-      </w:r>
-      <w:r>
-        <w:t>i. Correlation of V2R surface</w:t>
+        <w:t>entropy. f-g. Correlation of GPR68 mutational tolerance at pH 5.5 with conservation and entropy. h-</w:t>
+      </w:r>
+      <w:proofErr w:type="spellStart"/>
+      <w:r>
+        <w:rPr>
+          <w:rFonts w:ascii="Arial" w:hAnsi="Arial" w:cs="Arial"/>
+        </w:rPr>
+        <w:t>i</w:t>
+      </w:r>
+      <w:proofErr w:type="spellEnd"/>
+      <w:r>
+        <w:rPr>
+          <w:rFonts w:ascii="Arial" w:hAnsi="Arial" w:cs="Arial"/>
+        </w:rPr>
+        <w:t>. Correlation of V2R surface</w:t>
       </w:r>
       <w:r>
         <w:rPr>
@@ -698,22 +831,10 @@
         <w:t>‑</w:t>
       </w:r>
       <w:r>
-        <w:t>expression</w:t>
-      </w:r>
-      <w:r>
-        <w:rPr>
-          <w:rFonts w:ascii="Aptos" w:hAnsi="Aptos" w:cs="Aptos"/>
-        </w:rPr>
-        <w:t>-</w:t>
-      </w:r>
-      <w:r>
-        <w:t>derived mutational tolerance with conservation and entropy. j</w:t>
-      </w:r>
-      <w:r>
-        <w:t>-</w:t>
-      </w:r>
-      <w:r>
-        <w:t>k. Correlation of B2AR G</w:t>
+        <w:rPr>
+          <w:rFonts w:ascii="Arial" w:hAnsi="Arial" w:cs="Arial"/>
+        </w:rPr>
+        <w:t>expression-derived mutational tolerance with conservation and entropy. j-k. Correlation of B2AR G</w:t>
       </w:r>
       <w:r>
         <w:rPr>
@@ -722,31 +843,10 @@
         <w:t>‑</w:t>
       </w:r>
       <w:r>
-        <w:t>protein</w:t>
-      </w:r>
-      <w:r>
-        <w:rPr>
-          <w:rFonts w:ascii="Aptos" w:hAnsi="Aptos" w:cs="Aptos"/>
-        </w:rPr>
-        <w:t>-</w:t>
-      </w:r>
-      <w:r>
-        <w:t>based mutational tolerance with conservation and entropy. l</w:t>
-      </w:r>
-      <w:r>
-        <w:rPr>
-          <w:rFonts w:ascii="Aptos" w:hAnsi="Aptos" w:cs="Aptos"/>
-        </w:rPr>
-        <w:t>-</w:t>
-      </w:r>
-      <w:r>
-        <w:t xml:space="preserve">m. Correlation of B2AR </w:t>
-      </w:r>
-      <w:r>
-        <w:rPr>
-          <w:rFonts w:ascii="Aptos" w:hAnsi="Aptos" w:cs="Aptos"/>
-        </w:rPr>
-        <w:t>β</w:t>
+        <w:rPr>
+          <w:rFonts w:ascii="Arial" w:hAnsi="Arial" w:cs="Arial"/>
+        </w:rPr>
+        <w:t>protein-based mutational tolerance with conservation and entropy. l-m. Correlation of B2AR β</w:t>
       </w:r>
       <w:r>
         <w:rPr>
@@ -754,62 +854,48 @@
         </w:rPr>
         <w:t>‑</w:t>
       </w:r>
-      <w:r>
+      <w:proofErr w:type="spellStart"/>
+      <w:r>
+        <w:rPr>
+          <w:rFonts w:ascii="Arial" w:hAnsi="Arial" w:cs="Arial"/>
+        </w:rPr>
         <w:t>arrestin</w:t>
       </w:r>
-      <w:r>
-        <w:rPr>
-          <w:rFonts w:ascii="Aptos" w:hAnsi="Aptos" w:cs="Aptos"/>
-        </w:rPr>
-        <w:t>-</w:t>
-      </w:r>
-      <w:r>
-        <w:t>based mutational tolerance with conservation and entropy. n</w:t>
-      </w:r>
-      <w:r>
-        <w:rPr>
-          <w:rFonts w:ascii="Aptos" w:hAnsi="Aptos" w:cs="Aptos"/>
-        </w:rPr>
-        <w:t>-</w:t>
-      </w:r>
-      <w:r>
-        <w:t>o. Correlation of a combined class A mutational tolerance score with conservation and entropy. p</w:t>
-      </w:r>
-      <w:r>
-        <w:rPr>
-          <w:rFonts w:ascii="Aptos" w:hAnsi="Aptos" w:cs="Aptos"/>
-        </w:rPr>
-        <w:t>-</w:t>
-      </w:r>
-      <w:r>
-        <w:t>q. Correlation of ClinVar pathogenicity scores with conservation and entropy. r</w:t>
-      </w:r>
-      <w:r>
-        <w:rPr>
-          <w:rFonts w:ascii="Aptos" w:hAnsi="Aptos" w:cs="Aptos"/>
-        </w:rPr>
-        <w:t>-</w:t>
-      </w:r>
-      <w:r>
-        <w:t>s. Correlation of B2AR agonist potency (normalized logEC50) with conservation and entropy. t</w:t>
-      </w:r>
-      <w:r>
-        <w:rPr>
-          <w:rFonts w:ascii="Aptos" w:hAnsi="Aptos" w:cs="Aptos"/>
-        </w:rPr>
-        <w:t>-</w:t>
-      </w:r>
-      <w:r>
-        <w:t>u. Correlation of B2AR agonist efficacy (normalized amplitude) with conservation and entropy.</w:t>
-      </w:r>
-    </w:p>
-    <w:p>
-      <w:r>
-        <w:rPr>
+      <w:proofErr w:type="spellEnd"/>
+      <w:r>
+        <w:rPr>
+          <w:rFonts w:ascii="Arial" w:hAnsi="Arial" w:cs="Arial"/>
+        </w:rPr>
+        <w:t xml:space="preserve">-based mutational tolerance with conservation and entropy. n-o. Correlation of a combined class A mutational tolerance score with conservation and entropy. p-q. Correlation of </w:t>
+      </w:r>
+      <w:proofErr w:type="spellStart"/>
+      <w:r>
+        <w:rPr>
+          <w:rFonts w:ascii="Arial" w:hAnsi="Arial" w:cs="Arial"/>
+        </w:rPr>
+        <w:t>ClinVar</w:t>
+      </w:r>
+      <w:proofErr w:type="spellEnd"/>
+      <w:r>
+        <w:rPr>
+          <w:rFonts w:ascii="Arial" w:hAnsi="Arial" w:cs="Arial"/>
+        </w:rPr>
+        <w:t xml:space="preserve"> pathogenicity scores with conservation and entropy. r-s. Correlation of B2AR agonist potency (normalized logEC50) with conservation and entropy. t-u. Correlation of B2AR agonist efficacy (normalized amplitude) with conservation and entropy.</w:t>
+      </w:r>
+    </w:p>
+    <w:p>
+      <w:pPr>
+        <w:rPr>
+          <w:rFonts w:ascii="Arial" w:hAnsi="Arial" w:cs="Arial"/>
+        </w:rPr>
+      </w:pPr>
+      <w:r>
+        <w:rPr>
+          <w:rFonts w:ascii="Arial" w:hAnsi="Arial" w:cs="Arial"/>
           <w:noProof/>
         </w:rPr>
         <w:drawing>
-          <wp:inline distT="0" distB="0" distL="0" distR="0" wp14:anchorId="73739FF2" wp14:editId="01797607">
+          <wp:inline distT="0" distB="0" distL="0" distR="0" wp14:anchorId="44A2B009" wp14:editId="30482402">
             <wp:extent cx="5934710" cy="2021541"/>
             <wp:effectExtent l="0" t="0" r="0" b="0"/>
             <wp:docPr id="764451366" name="Picture 2"/>
@@ -826,7 +912,7 @@
                     </pic:cNvPicPr>
                   </pic:nvPicPr>
                   <pic:blipFill rotWithShape="1">
-                    <a:blip r:embed="rId6" cstate="print">
+                    <a:blip r:embed="rId9" cstate="print">
                       <a:extLst>
                         <a:ext uri="{28A0092B-C50C-407E-A947-70E740481C1C}">
                           <a14:useLocalDpi xmlns:a14="http://schemas.microsoft.com/office/drawing/2010/main" val="0"/>
@@ -864,67 +950,377 @@
       </w:r>
     </w:p>
     <w:p>
-      <w:r>
-        <w:rPr>
+      <w:pPr>
+        <w:rPr>
+          <w:rFonts w:ascii="Arial" w:hAnsi="Arial" w:cs="Arial"/>
+        </w:rPr>
+      </w:pPr>
+      <w:r>
+        <w:rPr>
+          <w:rFonts w:ascii="Arial" w:hAnsi="Arial" w:cs="Arial"/>
           <w:b/>
           <w:bCs/>
         </w:rPr>
-        <w:t>Figure S</w:t>
-      </w:r>
-      <w:r>
-        <w:rPr>
+        <w:t xml:space="preserve">Figure S3: Comparison of class A-wide conservation patterns against previous evolutionary studies. </w:t>
+      </w:r>
+      <w:r>
+        <w:rPr>
+          <w:rFonts w:ascii="Arial" w:hAnsi="Arial" w:cs="Arial"/>
+        </w:rPr>
+        <w:t xml:space="preserve">a. Comparison with global (analogous to CRs) and opsin-specific (analogous to SRs) residues identified by </w:t>
+      </w:r>
+      <w:proofErr w:type="spellStart"/>
+      <w:r>
+        <w:rPr>
+          <w:rFonts w:ascii="Arial" w:hAnsi="Arial" w:cs="Arial"/>
+        </w:rPr>
+        <w:t>Madsubshi</w:t>
+      </w:r>
+      <w:proofErr w:type="spellEnd"/>
+      <w:r>
+        <w:rPr>
+          <w:rFonts w:ascii="Arial" w:hAnsi="Arial" w:cs="Arial"/>
+        </w:rPr>
+        <w:t xml:space="preserve"> et al.</w:t>
+      </w:r>
+      <w:r>
+        <w:rPr>
+          <w:rFonts w:ascii="Arial" w:hAnsi="Arial" w:cs="Arial"/>
+        </w:rPr>
+        <w:fldChar w:fldCharType="begin">
+          <w:fldData xml:space="preserve">PEVuZE5vdGU+PENpdGU+PEF1dGhvcj5NYWRhYnVzaGk8L0F1dGhvcj48WWVhcj4yMDA0PC9ZZWFy
+PjxSZWNOdW0+MjAzPC9SZWNOdW0+PERpc3BsYXlUZXh0PjxzdHlsZSBmYWNlPSJzdXBlcnNjcmlw
+dCI+Nzwvc3R5bGU+PC9EaXNwbGF5VGV4dD48cmVjb3JkPjxyZWMtbnVtYmVyPjIwMzwvcmVjLW51
+bWJlcj48Zm9yZWlnbi1rZXlzPjxrZXkgYXBwPSJFTiIgZGItaWQ9InZzc3pwdjBzcngycDA3ZXhh
+cjd4OTBmMmU1d3Z2dnhzcGF4ciIgdGltZXN0YW1wPSIxNzAzNTI5NTc5Ij4yMDM8L2tleT48L2Zv
+cmVpZ24ta2V5cz48cmVmLXR5cGUgbmFtZT0iSm91cm5hbCBBcnRpY2xlIj4xNzwvcmVmLXR5cGU+
+PGNvbnRyaWJ1dG9ycz48YXV0aG9ycz48YXV0aG9yPk1hZGFidXNoaSwgUy48L2F1dGhvcj48YXV0
+aG9yPkdyb3NzLCBBLiBLLjwvYXV0aG9yPjxhdXRob3I+UGhpbGlwcGksIEEuPC9hdXRob3I+PGF1
+dGhvcj5NZW5nLCBFLiBDLjwvYXV0aG9yPjxhdXRob3I+V2Vuc2VsLCBULiBHLjwvYXV0aG9yPjxh
+dXRob3I+TGljaHRhcmdlLCBPLjwvYXV0aG9yPjwvYXV0aG9ycz48L2NvbnRyaWJ1dG9ycz48YXV0
+aC1hZGRyZXNzPlByb2dyYW0gaW4gU3RydWN0dXJhbCBhbmQgQ29tcHV0YXRpb25hbCBCaW9sb2d5
+IGFuZCBNb2xlY3VsYXIgQmlvcGh5c2ljcywgRGVwYXJ0bWVudCBvZiBNb2xlY3VsYXIgYW5kIEh1
+bWFuIEdlbmV0aWNzLCBCYXlsb3IgQ29sbGVnZSBvZiBNZWRpY2luZSwgSG91c3RvbiwgVGV4YXMg
+NzcwMzAsIFVTQS48L2F1dGgtYWRkcmVzcz48dGl0bGVzPjx0aXRsZT5Fdm9sdXRpb25hcnkgdHJh
+Y2Ugb2YgRyBwcm90ZWluLWNvdXBsZWQgcmVjZXB0b3JzIHJldmVhbHMgY2x1c3RlcnMgb2YgcmVz
+aWR1ZXMgdGhhdCBkZXRlcm1pbmUgZ2xvYmFsIGFuZCBjbGFzcy1zcGVjaWZpYyBmdW5jdGlvbnM8
+L3RpdGxlPjxzZWNvbmRhcnktdGl0bGU+SiBCaW9sIENoZW08L3NlY29uZGFyeS10aXRsZT48L3Rp
+dGxlcz48cGVyaW9kaWNhbD48ZnVsbC10aXRsZT5KIEJpb2wgQ2hlbTwvZnVsbC10aXRsZT48L3Bl
+cmlvZGljYWw+PHBhZ2VzPjgxMjYtMzI8L3BhZ2VzPjx2b2x1bWU+Mjc5PC92b2x1bWU+PG51bWJl
+cj45PC9udW1iZXI+PGVkaXRpb24+MjAwMzEyMDU8L2VkaXRpb24+PGtleXdvcmRzPjxrZXl3b3Jk
+PkFtaW5vIEFjaWQgU2VxdWVuY2U8L2tleXdvcmQ+PGtleXdvcmQ+QW5pbWFsczwva2V5d29yZD48
+a2V5d29yZD5CaW5kaW5nIFNpdGVzPC9rZXl3b3JkPjxrZXl3b3JkPkNhdHRsZTwva2V5d29yZD48
+a2V5d29yZD4qRXZvbHV0aW9uLCBNb2xlY3VsYXI8L2tleXdvcmQ+PGtleXdvcmQ+TGV1Y2luZTwv
+a2V5d29yZD48a2V5d29yZD5Nb2RlbHMsIE1vbGVjdWxhcjwva2V5d29yZD48a2V5d29yZD5Nb2xl
+Y3VsYXIgU3RydWN0dXJlPC9rZXl3b3JkPjxrZXl3b3JkPk11dGFnZW5lc2lzPC9rZXl3b3JkPjxr
+ZXl3b3JkPlBob3RvY2hlbWlzdHJ5PC9rZXl3b3JkPjxrZXl3b3JkPlByb3RlaW4gQ29uZm9ybWF0
+aW9uPC9rZXl3b3JkPjxrZXl3b3JkPlJlY2VwdG9ycywgRy1Qcm90ZWluLUNvdXBsZWQvKmNoZW1p
+c3RyeS9nZW5ldGljcy8qcGh5c2lvbG9neTwva2V5d29yZD48a2V5d29yZD5SaG9kb3BzaW4vY2hl
+bWlzdHJ5L2dlbmV0aWNzPC9rZXl3b3JkPjxrZXl3b3JkPlJvZCBPcHNpbnMvY2hlbWlzdHJ5L2dl
+bmV0aWNzPC9rZXl3b3JkPjxrZXl3b3JkPlNlcXVlbmNlIEFsaWdubWVudDwva2V5d29yZD48a2V5
+d29yZD5TaWduYWwgVHJhbnNkdWN0aW9uPC9rZXl3b3JkPjxrZXl3b3JkPlN0cnVjdHVyZS1BY3Rp
+dml0eSBSZWxhdGlvbnNoaXA8L2tleXdvcmQ+PGtleXdvcmQ+VHJ5cHRvcGhhbjwva2V5d29yZD48
+L2tleXdvcmRzPjxkYXRlcz48eWVhcj4yMDA0PC95ZWFyPjxwdWItZGF0ZXM+PGRhdGU+RmViIDI3
+PC9kYXRlPjwvcHViLWRhdGVzPjwvZGF0ZXM+PGlzYm4+MDAyMS05MjU4IChQcmludCkmI3hEOzAw
+MjEtOTI1ODwvaXNibj48YWNjZXNzaW9uLW51bT4xNDY2MDU5NTwvYWNjZXNzaW9uLW51bT48dXJs
+cz48L3VybHM+PGVsZWN0cm9uaWMtcmVzb3VyY2UtbnVtPjEwLjEwNzQvamJjLk0zMTI2NzEyMDA8
+L2VsZWN0cm9uaWMtcmVzb3VyY2UtbnVtPjxyZW1vdGUtZGF0YWJhc2UtcHJvdmlkZXI+TkxNPC9y
+ZW1vdGUtZGF0YWJhc2UtcHJvdmlkZXI+PGxhbmd1YWdlPmVuZzwvbGFuZ3VhZ2U+PC9yZWNvcmQ+
+PC9DaXRlPjwvRW5kTm90ZT4A
+</w:fldData>
+        </w:fldChar>
+      </w:r>
+      <w:r>
+        <w:rPr>
+          <w:rFonts w:ascii="Arial" w:hAnsi="Arial" w:cs="Arial"/>
+        </w:rPr>
+        <w:instrText xml:space="preserve"> ADDIN EN.CITE </w:instrText>
+      </w:r>
+      <w:r>
+        <w:rPr>
+          <w:rFonts w:ascii="Arial" w:hAnsi="Arial" w:cs="Arial"/>
+        </w:rPr>
+        <w:fldChar w:fldCharType="begin">
+          <w:fldData xml:space="preserve">PEVuZE5vdGU+PENpdGU+PEF1dGhvcj5NYWRhYnVzaGk8L0F1dGhvcj48WWVhcj4yMDA0PC9ZZWFy
+PjxSZWNOdW0+MjAzPC9SZWNOdW0+PERpc3BsYXlUZXh0PjxzdHlsZSBmYWNlPSJzdXBlcnNjcmlw
+dCI+Nzwvc3R5bGU+PC9EaXNwbGF5VGV4dD48cmVjb3JkPjxyZWMtbnVtYmVyPjIwMzwvcmVjLW51
+bWJlcj48Zm9yZWlnbi1rZXlzPjxrZXkgYXBwPSJFTiIgZGItaWQ9InZzc3pwdjBzcngycDA3ZXhh
+cjd4OTBmMmU1d3Z2dnhzcGF4ciIgdGltZXN0YW1wPSIxNzAzNTI5NTc5Ij4yMDM8L2tleT48L2Zv
+cmVpZ24ta2V5cz48cmVmLXR5cGUgbmFtZT0iSm91cm5hbCBBcnRpY2xlIj4xNzwvcmVmLXR5cGU+
+PGNvbnRyaWJ1dG9ycz48YXV0aG9ycz48YXV0aG9yPk1hZGFidXNoaSwgUy48L2F1dGhvcj48YXV0
+aG9yPkdyb3NzLCBBLiBLLjwvYXV0aG9yPjxhdXRob3I+UGhpbGlwcGksIEEuPC9hdXRob3I+PGF1
+dGhvcj5NZW5nLCBFLiBDLjwvYXV0aG9yPjxhdXRob3I+V2Vuc2VsLCBULiBHLjwvYXV0aG9yPjxh
+dXRob3I+TGljaHRhcmdlLCBPLjwvYXV0aG9yPjwvYXV0aG9ycz48L2NvbnRyaWJ1dG9ycz48YXV0
+aC1hZGRyZXNzPlByb2dyYW0gaW4gU3RydWN0dXJhbCBhbmQgQ29tcHV0YXRpb25hbCBCaW9sb2d5
+IGFuZCBNb2xlY3VsYXIgQmlvcGh5c2ljcywgRGVwYXJ0bWVudCBvZiBNb2xlY3VsYXIgYW5kIEh1
+bWFuIEdlbmV0aWNzLCBCYXlsb3IgQ29sbGVnZSBvZiBNZWRpY2luZSwgSG91c3RvbiwgVGV4YXMg
+NzcwMzAsIFVTQS48L2F1dGgtYWRkcmVzcz48dGl0bGVzPjx0aXRsZT5Fdm9sdXRpb25hcnkgdHJh
+Y2Ugb2YgRyBwcm90ZWluLWNvdXBsZWQgcmVjZXB0b3JzIHJldmVhbHMgY2x1c3RlcnMgb2YgcmVz
+aWR1ZXMgdGhhdCBkZXRlcm1pbmUgZ2xvYmFsIGFuZCBjbGFzcy1zcGVjaWZpYyBmdW5jdGlvbnM8
+L3RpdGxlPjxzZWNvbmRhcnktdGl0bGU+SiBCaW9sIENoZW08L3NlY29uZGFyeS10aXRsZT48L3Rp
+dGxlcz48cGVyaW9kaWNhbD48ZnVsbC10aXRsZT5KIEJpb2wgQ2hlbTwvZnVsbC10aXRsZT48L3Bl
+cmlvZGljYWw+PHBhZ2VzPjgxMjYtMzI8L3BhZ2VzPjx2b2x1bWU+Mjc5PC92b2x1bWU+PG51bWJl
+cj45PC9udW1iZXI+PGVkaXRpb24+MjAwMzEyMDU8L2VkaXRpb24+PGtleXdvcmRzPjxrZXl3b3Jk
+PkFtaW5vIEFjaWQgU2VxdWVuY2U8L2tleXdvcmQ+PGtleXdvcmQ+QW5pbWFsczwva2V5d29yZD48
+a2V5d29yZD5CaW5kaW5nIFNpdGVzPC9rZXl3b3JkPjxrZXl3b3JkPkNhdHRsZTwva2V5d29yZD48
+a2V5d29yZD4qRXZvbHV0aW9uLCBNb2xlY3VsYXI8L2tleXdvcmQ+PGtleXdvcmQ+TGV1Y2luZTwv
+a2V5d29yZD48a2V5d29yZD5Nb2RlbHMsIE1vbGVjdWxhcjwva2V5d29yZD48a2V5d29yZD5Nb2xl
+Y3VsYXIgU3RydWN0dXJlPC9rZXl3b3JkPjxrZXl3b3JkPk11dGFnZW5lc2lzPC9rZXl3b3JkPjxr
+ZXl3b3JkPlBob3RvY2hlbWlzdHJ5PC9rZXl3b3JkPjxrZXl3b3JkPlByb3RlaW4gQ29uZm9ybWF0
+aW9uPC9rZXl3b3JkPjxrZXl3b3JkPlJlY2VwdG9ycywgRy1Qcm90ZWluLUNvdXBsZWQvKmNoZW1p
+c3RyeS9nZW5ldGljcy8qcGh5c2lvbG9neTwva2V5d29yZD48a2V5d29yZD5SaG9kb3BzaW4vY2hl
+bWlzdHJ5L2dlbmV0aWNzPC9rZXl3b3JkPjxrZXl3b3JkPlJvZCBPcHNpbnMvY2hlbWlzdHJ5L2dl
+bmV0aWNzPC9rZXl3b3JkPjxrZXl3b3JkPlNlcXVlbmNlIEFsaWdubWVudDwva2V5d29yZD48a2V5
+d29yZD5TaWduYWwgVHJhbnNkdWN0aW9uPC9rZXl3b3JkPjxrZXl3b3JkPlN0cnVjdHVyZS1BY3Rp
+dml0eSBSZWxhdGlvbnNoaXA8L2tleXdvcmQ+PGtleXdvcmQ+VHJ5cHRvcGhhbjwva2V5d29yZD48
+L2tleXdvcmRzPjxkYXRlcz48eWVhcj4yMDA0PC95ZWFyPjxwdWItZGF0ZXM+PGRhdGU+RmViIDI3
+PC9kYXRlPjwvcHViLWRhdGVzPjwvZGF0ZXM+PGlzYm4+MDAyMS05MjU4IChQcmludCkmI3hEOzAw
+MjEtOTI1ODwvaXNibj48YWNjZXNzaW9uLW51bT4xNDY2MDU5NTwvYWNjZXNzaW9uLW51bT48dXJs
+cz48L3VybHM+PGVsZWN0cm9uaWMtcmVzb3VyY2UtbnVtPjEwLjEwNzQvamJjLk0zMTI2NzEyMDA8
+L2VsZWN0cm9uaWMtcmVzb3VyY2UtbnVtPjxyZW1vdGUtZGF0YWJhc2UtcHJvdmlkZXI+TkxNPC9y
+ZW1vdGUtZGF0YWJhc2UtcHJvdmlkZXI+PGxhbmd1YWdlPmVuZzwvbGFuZ3VhZ2U+PC9yZWNvcmQ+
+PC9DaXRlPjwvRW5kTm90ZT4A
+</w:fldData>
+        </w:fldChar>
+      </w:r>
+      <w:r>
+        <w:rPr>
+          <w:rFonts w:ascii="Arial" w:hAnsi="Arial" w:cs="Arial"/>
+        </w:rPr>
+        <w:instrText xml:space="preserve"> ADDIN EN.CITE.DATA </w:instrText>
+      </w:r>
+      <w:r>
+        <w:rPr>
+          <w:rFonts w:ascii="Arial" w:hAnsi="Arial" w:cs="Arial"/>
+        </w:rPr>
+      </w:r>
+      <w:r>
+        <w:rPr>
+          <w:rFonts w:ascii="Arial" w:hAnsi="Arial" w:cs="Arial"/>
+        </w:rPr>
+        <w:fldChar w:fldCharType="end"/>
+      </w:r>
+      <w:r>
+        <w:rPr>
+          <w:rFonts w:ascii="Arial" w:hAnsi="Arial" w:cs="Arial"/>
+        </w:rPr>
+        <w:fldChar w:fldCharType="separate"/>
+      </w:r>
+      <w:r>
+        <w:rPr>
+          <w:rFonts w:ascii="Arial" w:hAnsi="Arial" w:cs="Arial"/>
+          <w:noProof/>
+          <w:vertAlign w:val="superscript"/>
+        </w:rPr>
+        <w:t>7</w:t>
+      </w:r>
+      <w:r>
+        <w:rPr>
+          <w:rFonts w:ascii="Arial" w:hAnsi="Arial" w:cs="Arial"/>
+        </w:rPr>
+        <w:fldChar w:fldCharType="end"/>
+      </w:r>
+      <w:r>
+        <w:rPr>
+          <w:rFonts w:ascii="Arial" w:hAnsi="Arial" w:cs="Arial"/>
+        </w:rPr>
+        <w:t xml:space="preserve"> Global positions are colored as light blue, opsin-specific ones are colored as purple. b. Comparison of most significant 14 residues identified as candidate ligand binding positions by using ssTEA</w:t>
+      </w:r>
+      <w:r>
+        <w:rPr>
+          <w:rFonts w:ascii="Arial" w:hAnsi="Arial" w:cs="Arial"/>
+        </w:rPr>
+        <w:fldChar w:fldCharType="begin"/>
+      </w:r>
+      <w:r>
+        <w:rPr>
+          <w:rFonts w:ascii="Arial" w:hAnsi="Arial" w:cs="Arial"/>
+        </w:rPr>
+        <w:instrText xml:space="preserve"> ADDIN EN.CITE &lt;EndNote&gt;&lt;Cite&gt;&lt;Author&gt;Sanders&lt;/Author&gt;&lt;Year&gt;2011&lt;/Year&gt;&lt;RecNum&gt;174&lt;/RecNum&gt;&lt;DisplayText&gt;&lt;style face="superscript"&gt;8&lt;/style&gt;&lt;/DisplayText&gt;&lt;record&gt;&lt;rec-number&gt;174&lt;/rec-number&gt;&lt;foreign-keys&gt;&lt;key app="EN" db-id="vsszpv0srx2p07exar7x90f2e5wvvvxspaxr" timestamp="1697053108"&gt;174&lt;/key&gt;&lt;/foreign-keys&gt;&lt;ref-type name="Journal Article"&gt;17&lt;/ref-type&gt;&lt;contributors&gt;&lt;authors&gt;&lt;author&gt;Sanders, Marijn Pa&lt;/author&gt;&lt;author&gt;Fleuren, Wilco Wm&lt;/author&gt;&lt;author&gt;Verhoeven, Stefan&lt;/author&gt;&lt;author&gt;Van Den Beld, Sven&lt;/author&gt;&lt;author&gt;Alkema, Wynand&lt;/author&gt;&lt;author&gt;De Vlieg, Jacob&lt;/author&gt;&lt;author&gt;Klomp, Jan Pg&lt;/author&gt;&lt;/authors&gt;&lt;/contributors&gt;&lt;titles&gt;&lt;title&gt;ss-TEA: Entropy based identification of receptor specific ligand binding residues from a multiple sequence alignment of class A GPCRs&lt;/title&gt;&lt;secondary-title&gt;BMC Bioinformatics&lt;/secondary-title&gt;&lt;/titles&gt;&lt;periodical&gt;&lt;full-title&gt;BMC Bioinformatics&lt;/full-title&gt;&lt;/periodical&gt;&lt;pages&gt;332&lt;/pages&gt;&lt;volume&gt;12&lt;/volume&gt;&lt;number&gt;1&lt;/number&gt;&lt;dates&gt;&lt;year&gt;2011&lt;/year&gt;&lt;/dates&gt;&lt;publisher&gt;Springer Science and Business Media LLC&lt;/publisher&gt;&lt;isbn&gt;1471-2105&lt;/isbn&gt;&lt;urls&gt;&lt;related-urls&gt;&lt;url&gt;https://dx.doi.org/10.1186/1471-2105-12-332&lt;/url&gt;&lt;/related-urls&gt;&lt;/urls&gt;&lt;electronic-resource-num&gt;10.1186/1471-2105-12-332&lt;/electronic-resource-num&gt;&lt;/record&gt;&lt;/Cite&gt;&lt;/EndNote&gt;</w:instrText>
+      </w:r>
+      <w:r>
+        <w:rPr>
+          <w:rFonts w:ascii="Arial" w:hAnsi="Arial" w:cs="Arial"/>
+        </w:rPr>
+        <w:fldChar w:fldCharType="separate"/>
+      </w:r>
+      <w:r>
+        <w:rPr>
+          <w:rFonts w:ascii="Arial" w:hAnsi="Arial" w:cs="Arial"/>
+          <w:noProof/>
+          <w:vertAlign w:val="superscript"/>
+        </w:rPr>
+        <w:t>8</w:t>
+      </w:r>
+      <w:r>
+        <w:rPr>
+          <w:rFonts w:ascii="Arial" w:hAnsi="Arial" w:cs="Arial"/>
+        </w:rPr>
+        <w:fldChar w:fldCharType="end"/>
+      </w:r>
+      <w:r>
+        <w:rPr>
+          <w:rFonts w:ascii="Arial" w:hAnsi="Arial" w:cs="Arial"/>
+        </w:rPr>
+        <w:t xml:space="preserve"> approach. Residues are shown in black color.</w:t>
+      </w:r>
+    </w:p>
+    <w:p>
+      <w:pPr>
+        <w:rPr>
+          <w:rFonts w:ascii="Arial" w:hAnsi="Arial" w:cs="Arial"/>
+        </w:rPr>
+      </w:pPr>
+      <w:r>
+        <w:rPr>
+          <w:noProof/>
+        </w:rPr>
+        <w:lastRenderedPageBreak/>
+        <w:drawing>
+          <wp:inline distT="0" distB="0" distL="0" distR="0" wp14:anchorId="5A9A394A" wp14:editId="6994C08B">
+            <wp:extent cx="5943600" cy="3773805"/>
+            <wp:effectExtent l="0" t="0" r="0" b="0"/>
+            <wp:docPr id="1743920139" name="Picture 1"/>
+            <wp:cNvGraphicFramePr>
+              <a:graphicFrameLocks xmlns:a="http://schemas.openxmlformats.org/drawingml/2006/main" noChangeAspect="1"/>
+            </wp:cNvGraphicFramePr>
+            <a:graphic xmlns:a="http://schemas.openxmlformats.org/drawingml/2006/main">
+              <a:graphicData uri="http://schemas.openxmlformats.org/drawingml/2006/picture">
+                <pic:pic xmlns:pic="http://schemas.openxmlformats.org/drawingml/2006/picture">
+                  <pic:nvPicPr>
+                    <pic:cNvPr id="0" name="Picture 1"/>
+                    <pic:cNvPicPr>
+                      <a:picLocks noChangeAspect="1" noChangeArrowheads="1"/>
+                    </pic:cNvPicPr>
+                  </pic:nvPicPr>
+                  <pic:blipFill>
+                    <a:blip r:embed="rId10" cstate="print">
+                      <a:extLst>
+                        <a:ext uri="{28A0092B-C50C-407E-A947-70E740481C1C}">
+                          <a14:useLocalDpi xmlns:a14="http://schemas.microsoft.com/office/drawing/2010/main" val="0"/>
+                        </a:ext>
+                      </a:extLst>
+                    </a:blip>
+                    <a:srcRect/>
+                    <a:stretch>
+                      <a:fillRect/>
+                    </a:stretch>
+                  </pic:blipFill>
+                  <pic:spPr bwMode="auto">
+                    <a:xfrm>
+                      <a:off x="0" y="0"/>
+                      <a:ext cx="5943600" cy="3773805"/>
+                    </a:xfrm>
+                    <a:prstGeom prst="rect">
+                      <a:avLst/>
+                    </a:prstGeom>
+                    <a:noFill/>
+                    <a:ln>
+                      <a:noFill/>
+                    </a:ln>
+                  </pic:spPr>
+                </pic:pic>
+              </a:graphicData>
+            </a:graphic>
+          </wp:inline>
+        </w:drawing>
+      </w:r>
+    </w:p>
+    <w:p>
+      <w:pPr>
+        <w:rPr>
+          <w:rFonts w:ascii="Arial" w:hAnsi="Arial" w:cs="Arial"/>
+        </w:rPr>
+      </w:pPr>
+      <w:r>
+        <w:rPr>
+          <w:rFonts w:ascii="Arial" w:hAnsi="Arial" w:cs="Arial"/>
           <w:b/>
           <w:bCs/>
         </w:rPr>
-        <w:t>3</w:t>
-      </w:r>
-      <w:r>
-        <w:rPr>
-          <w:b/>
-          <w:bCs/>
-        </w:rPr>
-        <w:t xml:space="preserve">: </w:t>
-      </w:r>
-      <w:r>
-        <w:rPr>
-          <w:b/>
-          <w:bCs/>
-        </w:rPr>
-        <w:t>Comparison of class A</w:t>
-      </w:r>
-      <w:r>
-        <w:rPr>
-          <w:b/>
-          <w:bCs/>
-        </w:rPr>
-        <w:t xml:space="preserve">-wide conservation patterns against previous evolutionary studies. </w:t>
-      </w:r>
-      <w:r>
-        <w:t>a. Comparison with global</w:t>
-      </w:r>
-      <w:r>
-        <w:t xml:space="preserve"> (analogous to CRs)</w:t>
-      </w:r>
-      <w:r>
-        <w:t xml:space="preserve"> </w:t>
-      </w:r>
-      <w:r>
-        <w:t>and opsin</w:t>
-      </w:r>
-      <w:r>
-        <w:t>-</w:t>
-      </w:r>
-      <w:r>
-        <w:t>specific (analogous to SRs) residues identified by Madsubshi et al.</w:t>
-      </w:r>
-      <w:r>
-        <w:t xml:space="preserve"> Global positions are colored as light blue, opsion-specific ones are colored as purple. </w:t>
-      </w:r>
-      <w:r>
-        <w:t>b. Comparison of most significant 14 residues identified as candidate ligand binding positions by using ssTEA approach. Residues are shown in black color.</w:t>
-      </w:r>
-    </w:p>
-    <w:p/>
+        <w:t xml:space="preserve">Figure S4: Spatial enrichment of high- and low-entropy residues at different family-wide conservation thresholds. </w:t>
+      </w:r>
+      <w:r>
+        <w:rPr>
+          <w:rFonts w:ascii="Arial" w:hAnsi="Arial" w:cs="Arial"/>
+        </w:rPr>
+        <w:t xml:space="preserve">Cα atoms corresponding to residues that pass the indicated family-wide conservation threshold are shown on the </w:t>
+      </w:r>
+      <w:r>
+        <w:rPr>
+          <w:rFonts w:ascii="Arial" w:hAnsi="Arial" w:cs="Arial"/>
+        </w:rPr>
+        <w:t>AlphaFold2 human Histamine H2 receptor model</w:t>
+      </w:r>
+      <w:r>
+        <w:rPr>
+          <w:rFonts w:ascii="Arial" w:hAnsi="Arial" w:cs="Arial"/>
+        </w:rPr>
+        <w:fldChar w:fldCharType="begin"/>
+      </w:r>
+      <w:r>
+        <w:rPr>
+          <w:rFonts w:ascii="Arial" w:hAnsi="Arial" w:cs="Arial"/>
+        </w:rPr>
+        <w:instrText xml:space="preserve"> ADDIN EN.CITE &lt;EndNote&gt;&lt;Cite&gt;&lt;Author&gt;Varadi&lt;/Author&gt;&lt;Year&gt;2024&lt;/Year&gt;&lt;RecNum&gt;292&lt;/RecNum&gt;&lt;DisplayText&gt;&lt;style face="superscript"&gt;9&lt;/style&gt;&lt;/DisplayText&gt;&lt;record&gt;&lt;rec-number&gt;292&lt;/rec-number&gt;&lt;foreign-keys&gt;&lt;key app="EN" db-id="vsszpv0srx2p07exar7x90f2e5wvvvxspaxr" timestamp="1731874490"&gt;292&lt;/key&gt;&lt;/foreign-keys&gt;&lt;ref-type name="Journal Article"&gt;17&lt;/ref-type&gt;&lt;contributors&gt;&lt;authors&gt;&lt;author&gt;Varadi, Mihaly&lt;/author&gt;&lt;author&gt;Bertoni, Damian&lt;/author&gt;&lt;author&gt;Magana, Paulyna&lt;/author&gt;&lt;author&gt;Paramval, Urmila&lt;/author&gt;&lt;author&gt;Pidruchna, Ivanna&lt;/author&gt;&lt;author&gt;Radhakrishnan, Malarvizhi&lt;/author&gt;&lt;author&gt;Tsenkov, Maxim&lt;/author&gt;&lt;author&gt;Nair, Sreenath&lt;/author&gt;&lt;author&gt;Mirdita, Milot&lt;/author&gt;&lt;author&gt;Yeo, Jingi&lt;/author&gt;&lt;author&gt;Kovalevskiy, Oleg&lt;/author&gt;&lt;author&gt;Tunyasuvunakool, Kathryn&lt;/author&gt;&lt;author&gt;Laydon, Agata&lt;/author&gt;&lt;author&gt;Žídek, Augustin&lt;/author&gt;&lt;author&gt;Tomlinson, Hamish&lt;/author&gt;&lt;author&gt;Hariharan, Dhavanthi&lt;/author&gt;&lt;author&gt;Abrahamson, Josh&lt;/author&gt;&lt;author&gt;Green, Tim&lt;/author&gt;&lt;author&gt;Jumper, John&lt;/author&gt;&lt;author&gt;Birney, Ewan&lt;/author&gt;&lt;author&gt;Steinegger, Martin&lt;/author&gt;&lt;author&gt;Hassabis, Demis&lt;/author&gt;&lt;author&gt;Velankar, Sameer&lt;/author&gt;&lt;/authors&gt;&lt;/contributors&gt;&lt;titles&gt;&lt;title&gt;AlphaFold Protein Structure Database in 2024: providing structure coverage for over 214 million protein sequences&lt;/title&gt;&lt;secondary-title&gt;Nucleic Acids Research&lt;/secondary-title&gt;&lt;/titles&gt;&lt;periodical&gt;&lt;full-title&gt;Nucleic Acids Research&lt;/full-title&gt;&lt;/periodical&gt;&lt;pages&gt;D368-D375&lt;/pages&gt;&lt;volume&gt;52&lt;/volume&gt;&lt;number&gt;D1&lt;/number&gt;&lt;dates&gt;&lt;year&gt;2024&lt;/year&gt;&lt;/dates&gt;&lt;publisher&gt;Oxford University Press (OUP)&lt;/publisher&gt;&lt;isbn&gt;0305-1048&lt;/isbn&gt;&lt;urls&gt;&lt;related-urls&gt;&lt;url&gt;https://dx.doi.org/10.1093/nar/gkad1011&lt;/url&gt;&lt;/related-urls&gt;&lt;/urls&gt;&lt;electronic-resource-num&gt;10.1093/nar/gkad1011&lt;/electronic-resource-num&gt;&lt;/record&gt;&lt;/Cite&gt;&lt;/EndNote&gt;</w:instrText>
+      </w:r>
+      <w:r>
+        <w:rPr>
+          <w:rFonts w:ascii="Arial" w:hAnsi="Arial" w:cs="Arial"/>
+        </w:rPr>
+        <w:fldChar w:fldCharType="separate"/>
+      </w:r>
+      <w:r>
+        <w:rPr>
+          <w:rFonts w:ascii="Arial" w:hAnsi="Arial" w:cs="Arial"/>
+          <w:noProof/>
+          <w:vertAlign w:val="superscript"/>
+        </w:rPr>
+        <w:t>9</w:t>
+      </w:r>
+      <w:r>
+        <w:rPr>
+          <w:rFonts w:ascii="Arial" w:hAnsi="Arial" w:cs="Arial"/>
+        </w:rPr>
+        <w:fldChar w:fldCharType="end"/>
+      </w:r>
+      <w:r>
+        <w:rPr>
+          <w:rFonts w:ascii="Arial" w:hAnsi="Arial" w:cs="Arial"/>
+        </w:rPr>
+        <w:t xml:space="preserve"> at 70%, 50%, and 30%.</w:t>
+      </w:r>
+      <w:r>
+        <w:rPr>
+          <w:rFonts w:ascii="Arial" w:hAnsi="Arial" w:cs="Arial"/>
+        </w:rPr>
+        <w:t xml:space="preserve"> R</w:t>
+      </w:r>
+      <w:r>
+        <w:rPr>
+          <w:rFonts w:ascii="Arial" w:hAnsi="Arial" w:cs="Arial"/>
+        </w:rPr>
+        <w:t xml:space="preserve">esidues are colored by family-wide entropy, with high-entropy residues shown in red and low-entropy residues shown in blue. </w:t>
+      </w:r>
+    </w:p>
+    <w:p>
+      <w:pPr>
+        <w:pStyle w:val="Title"/>
+        <w:rPr>
+          <w:rFonts w:ascii="Arial" w:hAnsi="Arial" w:cs="Arial"/>
+          <w:sz w:val="40"/>
+          <w:szCs w:val="40"/>
+        </w:rPr>
+      </w:pPr>
+      <w:r>
+        <w:rPr>
+          <w:rFonts w:ascii="Arial" w:hAnsi="Arial" w:cs="Arial"/>
+          <w:sz w:val="40"/>
+          <w:szCs w:val="40"/>
+        </w:rPr>
+        <w:t>References</w:t>
+      </w:r>
+    </w:p>
     <w:p>
       <w:pPr>
         <w:pStyle w:val="EndNoteBibliography"/>
@@ -932,12 +1328,21 @@
         <w:ind w:left="720" w:hanging="720"/>
       </w:pPr>
       <w:r>
+        <w:rPr>
+          <w:rFonts w:ascii="Arial" w:hAnsi="Arial" w:cs="Arial"/>
+        </w:rPr>
         <w:fldChar w:fldCharType="begin"/>
       </w:r>
       <w:r>
+        <w:rPr>
+          <w:rFonts w:ascii="Arial" w:hAnsi="Arial" w:cs="Arial"/>
+        </w:rPr>
         <w:instrText xml:space="preserve"> ADDIN EN.REFLIST </w:instrText>
       </w:r>
       <w:r>
+        <w:rPr>
+          <w:rFonts w:ascii="Arial" w:hAnsi="Arial" w:cs="Arial"/>
+        </w:rPr>
         <w:fldChar w:fldCharType="separate"/>
       </w:r>
       <w:r>
@@ -954,13 +1359,7 @@
         <w:t xml:space="preserve"> et al.</w:t>
       </w:r>
       <w:r>
-        <w:t xml:space="preserve"> Structural and functional characterization of G protein</w:t>
-      </w:r>
-      <w:r>
-        <w:t>-</w:t>
-      </w:r>
-      <w:r>
-        <w:t xml:space="preserve">coupled receptors with deep mutational scanning. </w:t>
+        <w:t xml:space="preserve"> Structural and functional characterization of G protein–coupled receptors with deep mutational scanning. </w:t>
       </w:r>
       <w:r>
         <w:rPr>
@@ -980,7 +1379,7 @@
       <w:r>
         <w:t xml:space="preserve"> (2020). </w:t>
       </w:r>
-      <w:hyperlink r:id="rId9" w:history="1">
+      <w:hyperlink r:id="rId11" w:history="1">
         <w:r>
           <w:rPr>
             <w:rStyle w:val="Hyperlink"/>
@@ -1061,7 +1460,7 @@
       <w:r>
         <w:t xml:space="preserve">, 671-687.e620 (2025). </w:t>
       </w:r>
-      <w:hyperlink r:id="rId10" w:history="1">
+      <w:hyperlink r:id="rId12" w:history="1">
         <w:r>
           <w:rPr>
             <w:rStyle w:val="Hyperlink"/>
@@ -1092,7 +1491,7 @@
       <w:r>
         <w:t xml:space="preserve"> (2025). </w:t>
       </w:r>
-      <w:hyperlink r:id="rId11" w:history="1">
+      <w:hyperlink r:id="rId13" w:history="1">
         <w:r>
           <w:rPr>
             <w:rStyle w:val="Hyperlink"/>
@@ -1108,7 +1507,6 @@
         <w:ind w:left="720" w:hanging="720"/>
       </w:pPr>
       <w:r>
-        <w:lastRenderedPageBreak/>
         <w:t>5</w:t>
       </w:r>
       <w:r>
@@ -1128,9 +1526,11 @@
     <w:p>
       <w:pPr>
         <w:pStyle w:val="EndNoteBibliography"/>
+        <w:spacing w:after="0"/>
         <w:ind w:left="720" w:hanging="720"/>
       </w:pPr>
       <w:r>
+        <w:lastRenderedPageBreak/>
         <w:t>6</w:t>
       </w:r>
       <w:r>
@@ -1164,7 +1564,7 @@
       <w:r>
         <w:t xml:space="preserve">, eadh1859 (2023). </w:t>
       </w:r>
-      <w:hyperlink r:id="rId12" w:history="1">
+      <w:hyperlink r:id="rId14" w:history="1">
         <w:r>
           <w:rPr>
             <w:rStyle w:val="Hyperlink"/>
@@ -1174,9 +1574,171 @@
       </w:hyperlink>
     </w:p>
     <w:p>
-      <w:r>
+      <w:pPr>
+        <w:pStyle w:val="EndNoteBibliography"/>
+        <w:spacing w:after="0"/>
+        <w:ind w:left="720" w:hanging="720"/>
+      </w:pPr>
+      <w:r>
+        <w:t>7</w:t>
+      </w:r>
+      <w:r>
+        <w:tab/>
+        <w:t>Madabushi, S.</w:t>
+      </w:r>
+      <w:r>
+        <w:rPr>
+          <w:i/>
+        </w:rPr>
+        <w:t xml:space="preserve"> et al.</w:t>
+      </w:r>
+      <w:r>
+        <w:t xml:space="preserve"> Evolutionary trace of G protein-coupled receptors reveals clusters of residues that determine global and class-specific functions. </w:t>
+      </w:r>
+      <w:r>
+        <w:rPr>
+          <w:i/>
+        </w:rPr>
+        <w:t>J Biol Chem</w:t>
+      </w:r>
+      <w:r>
+        <w:t xml:space="preserve"> </w:t>
+      </w:r>
+      <w:r>
+        <w:rPr>
+          <w:b/>
+        </w:rPr>
+        <w:t>279</w:t>
+      </w:r>
+      <w:r>
+        <w:t xml:space="preserve">, 8126-8132 (2004). </w:t>
+      </w:r>
+      <w:hyperlink r:id="rId15" w:history="1">
+        <w:r>
+          <w:rPr>
+            <w:rStyle w:val="Hyperlink"/>
+          </w:rPr>
+          <w:t>https://doi.org:10.1074/jbc.M312671200</w:t>
+        </w:r>
+      </w:hyperlink>
+    </w:p>
+    <w:p>
+      <w:pPr>
+        <w:pStyle w:val="EndNoteBibliography"/>
+        <w:spacing w:after="0"/>
+        <w:ind w:left="720" w:hanging="720"/>
+      </w:pPr>
+      <w:r>
+        <w:t>8</w:t>
+      </w:r>
+      <w:r>
+        <w:tab/>
+        <w:t>Sanders, M. P.</w:t>
+      </w:r>
+      <w:r>
+        <w:rPr>
+          <w:i/>
+        </w:rPr>
+        <w:t xml:space="preserve"> et al.</w:t>
+      </w:r>
+      <w:r>
+        <w:t xml:space="preserve"> ss-TEA: Entropy based identification of receptor specific ligand binding residues from a multiple sequence alignment of class A GPCRs. </w:t>
+      </w:r>
+      <w:r>
+        <w:rPr>
+          <w:i/>
+        </w:rPr>
+        <w:t>BMC Bioinformatics</w:t>
+      </w:r>
+      <w:r>
+        <w:t xml:space="preserve"> </w:t>
+      </w:r>
+      <w:r>
+        <w:rPr>
+          <w:b/>
+        </w:rPr>
+        <w:t>12</w:t>
+      </w:r>
+      <w:r>
+        <w:t xml:space="preserve">, 332 (2011). </w:t>
+      </w:r>
+      <w:hyperlink r:id="rId16" w:history="1">
+        <w:r>
+          <w:rPr>
+            <w:rStyle w:val="Hyperlink"/>
+          </w:rPr>
+          <w:t>https://doi.org:10.1186/1471-2105-12-332</w:t>
+        </w:r>
+      </w:hyperlink>
+    </w:p>
+    <w:p>
+      <w:pPr>
+        <w:pStyle w:val="EndNoteBibliography"/>
+        <w:ind w:left="720" w:hanging="720"/>
+      </w:pPr>
+      <w:r>
+        <w:t>9</w:t>
+      </w:r>
+      <w:r>
+        <w:tab/>
+        <w:t>Varadi, M.</w:t>
+      </w:r>
+      <w:r>
+        <w:rPr>
+          <w:i/>
+        </w:rPr>
+        <w:t xml:space="preserve"> et al.</w:t>
+      </w:r>
+      <w:r>
+        <w:t xml:space="preserve"> AlphaFold Protein Structure Database in 2024: providing structure coverage for over 214 million protein sequences. </w:t>
+      </w:r>
+      <w:r>
+        <w:rPr>
+          <w:i/>
+        </w:rPr>
+        <w:t>Nucleic Acids Research</w:t>
+      </w:r>
+      <w:r>
+        <w:t xml:space="preserve"> </w:t>
+      </w:r>
+      <w:r>
+        <w:rPr>
+          <w:b/>
+        </w:rPr>
+        <w:t>52</w:t>
+      </w:r>
+      <w:r>
+        <w:t xml:space="preserve">, D368-D375 (2024). </w:t>
+      </w:r>
+      <w:hyperlink r:id="rId17" w:history="1">
+        <w:r>
+          <w:rPr>
+            <w:rStyle w:val="Hyperlink"/>
+          </w:rPr>
+          <w:t>https://doi.org:10.1093/nar/gkad1011</w:t>
+        </w:r>
+      </w:hyperlink>
+    </w:p>
+    <w:p>
+      <w:pPr>
+        <w:rPr>
+          <w:rFonts w:ascii="Arial" w:hAnsi="Arial" w:cs="Arial"/>
+        </w:rPr>
+      </w:pPr>
+      <w:r>
+        <w:rPr>
+          <w:rFonts w:ascii="Arial" w:hAnsi="Arial" w:cs="Arial"/>
+        </w:rPr>
         <w:fldChar w:fldCharType="end"/>
       </w:r>
+    </w:p>
+    <w:bookmarkEnd w:id="0"/>
+    <w:p>
+      <w:pPr>
+        <w:rPr>
+          <w:rFonts w:ascii="Arial" w:hAnsi="Arial" w:cs="Arial"/>
+        </w:rPr>
+      </w:pPr>
     </w:p>
     <w:sectPr>
       <w:pgSz w:w="12240" w:h="15840"/>
@@ -2298,6 +2860,16 @@
       <w:shd w:val="clear" w:color="auto" w:fill="E1DFDD"/>
     </w:rPr>
   </w:style>
+  <w:style w:type="paragraph" w:styleId="Revision">
+    <w:name w:val="Revision"/>
+    <w:hidden/>
+    <w:uiPriority w:val="99"/>
+    <w:semiHidden/>
+    <w:rsid w:val="00224F6C"/>
+    <w:pPr>
+      <w:spacing w:after="0" w:line="240" w:lineRule="auto"/>
+    </w:pPr>
+  </w:style>
 </w:styles>
 </file>
 

</xml_diff>